<commit_message>
Refocus dashboard on official resource data
</commit_message>
<xml_diff>
--- a/docs/RebootRoute_Project_Report.docx
+++ b/docs/RebootRoute_Project_Report.docx
@@ -70,7 +70,7 @@
                 <w:color w:val="17211D"/>
                 <w:sz w:val="19"/>
               </w:rPr>
-              <w:t>이 문서는 발표자가 RebootRoute의 구현 범위, 코드 구조, 데이터 흐름, 대시보드 사용법, MLOps 산출물, 한계와 운영 전 교체 항목을 빠짐없이 설명할 수 있도록 정리한 프로젝트 명세서입니다.</w:t>
+              <w:t>이 문서는 발표자가 RebootRoute의 구현 범위, 실제 데이터 구성, 대시보드 사용 순서, 코드 구조, MLOps 산출물, 한계와 운영 전 교체 항목을 정확히 설명할 수 있도록 정리한 프로젝트 명세서입니다.</w:t>
             </w:r>
           </w:p>
         </w:tc>
@@ -287,7 +287,7 @@
                 <w:color w:val="17211D"/>
                 <w:sz w:val="18"/>
               </w:rPr>
-              <w:t>2026-06-05</w:t>
+              <w:t>2026-06-08</w:t>
             </w:r>
           </w:p>
         </w:tc>
@@ -426,7 +426,7 @@
           <w:b w:val="0"/>
           <w:color w:val="17211D"/>
         </w:rPr>
-        <w:t>RebootRoute는 사용자의 상태 입력을 바탕으로 낮은 부담의 다음 행동을 추천하고, 인천 청년정책·문화활동 자원을 근거 자료와 함께 보여주는 MVP입니다. 추천의 핵심은 사용자를 취업이나 상담으로 바로 밀어 넣는 것이 아니라, 컨디션 정리, 비대면 준비, 동선 계획, 짧은 외출처럼 실제 결과가 남는 행동을 단계화하는 것입니다.</w:t>
+        <w:t>RebootRoute는 인천의 실제 청년정책·문화공간·문화행사 정보를 공식 출처 기반으로 보여주고, 사용자가 오늘 바로 끝낼 수 있는 작은 다음 행동을 제안하는 MVP입니다. 현재 실제 사용자 데이터를 확보할 수 없으므로, 사용자 화면은 개인 상태 입력을 요구하지 않고 공식 자원 확인과 조건 축소 흐름을 중심으로 설계했습니다.</w:t>
       </w:r>
     </w:p>
     <w:p>
@@ -440,7 +440,7 @@
           <w:rFonts w:ascii="Apple SD Gothic Neo" w:hAnsi="Apple SD Gothic Neo" w:eastAsia="Apple SD Gothic Neo"/>
           <w:color w:val="17211D"/>
         </w:rPr>
-        <w:t>현재 핵심 축은 local TF-IDF 기반 RAG와 부담도 기반 mission recommendation입니다.</w:t>
+        <w:t>현재 핵심 축은 공식 출처 기반 resource seed, local TF-IDF RAG, 부담도 기반 다음 행동 제안입니다.</w:t>
       </w:r>
     </w:p>
     <w:p>
@@ -482,7 +482,21 @@
           <w:rFonts w:ascii="Apple SD Gothic Neo" w:hAnsi="Apple SD Gothic Neo" w:eastAsia="Apple SD Gothic Neo"/>
           <w:color w:val="17211D"/>
         </w:rPr>
-        <w:t>초기 데이터 루프는 closed-loop A/B가 아니라 open-loop logging, human rubric evaluation, batch retraining입니다.</w:t>
+        <w:t>Synthetic profile과 synthetic label은 모델 학습, API 호환성, 운영자 점검, MLOps 시연 용도로만 유지합니다.</w:t>
+      </w:r>
+    </w:p>
+    <w:p>
+      <w:pPr>
+        <w:pStyle w:val="ListBullet"/>
+        <w:spacing w:before="0" w:after="80" w:line="300" w:lineRule="auto"/>
+        <w:ind w:left="547" w:hanging="274"/>
+      </w:pPr>
+      <w:r>
+        <w:rPr>
+          <w:rFonts w:ascii="Apple SD Gothic Neo" w:hAnsi="Apple SD Gothic Neo" w:eastAsia="Apple SD Gothic Neo"/>
+          <w:color w:val="17211D"/>
+        </w:rPr>
+        <w:t>초기 검증은 closed-loop A/B가 아니라 open-loop evaluation, human rubric evaluation, batch retraining이 적절합니다.</w:t>
       </w:r>
     </w:p>
     <w:p>
@@ -497,7 +511,7 @@
           <w:color w:val="0F766E"/>
           <w:sz w:val="32"/>
         </w:rPr>
-        <w:t>2. 사용자 문제와 단계형 루트</w:t>
+        <w:t>2. 사용자 화면 사용 순서</w:t>
       </w:r>
     </w:p>
     <w:p>
@@ -510,7 +524,7 @@
           <w:b w:val="0"/>
           <w:color w:val="17211D"/>
         </w:rPr>
-        <w:t>고립 또는 고립 위험 상태의 청년은 상담, 직업훈련, 취업 프로그램으로 바로 이동하기 어려울 수 있습니다. RebootRoute는 그 이전 단계에서 컨디션 정리, 비대면 준비, 동선 계획, 짧은 외출, 저부담 참여, 관심 기반 기록, 작은 결과물 만들기를 누적하도록 설계되었습니다.</w:t>
+        <w:t>대시보드의 첫 탭은 실제 사용자가 무엇을 먼저 보고 무엇을 얻는지 명확히 알 수 있도록 세 단계로 재구성했습니다. 필터를 변경하면 결과와 다음 행동이 즉시 갱신되며, 별도 업데이트 버튼이나 추천 루트 버튼을 누르지 않습니다.</w:t>
       </w:r>
     </w:p>
     <w:tbl>
@@ -550,13 +564,13 @@
                 <w:color w:val="17211D"/>
                 <w:sz w:val="18"/>
               </w:rPr>
-              <w:t>Stage</w:t>
+              <w:t>순서</w:t>
             </w:r>
           </w:p>
         </w:tc>
         <w:tc>
           <w:tcPr>
-            <w:tcW w:type="dxa" w:w="2300"/>
+            <w:tcW w:type="dxa" w:w="3200"/>
             <w:vAlign w:val="center"/>
             <w:shd w:fill="E8EEF5"/>
           </w:tcPr>
@@ -573,13 +587,13 @@
                 <w:color w:val="17211D"/>
                 <w:sz w:val="18"/>
               </w:rPr>
-              <w:t>의미</w:t>
+              <w:t>화면에서 하는 일</w:t>
             </w:r>
           </w:p>
         </w:tc>
         <w:tc>
           <w:tcPr>
-            <w:tcW w:type="dxa" w:w="6160"/>
+            <w:tcW w:type="dxa" w:w="5260"/>
             <w:vAlign w:val="center"/>
             <w:shd w:fill="E8EEF5"/>
           </w:tcPr>
@@ -596,78 +610,7 @@
                 <w:color w:val="17211D"/>
                 <w:sz w:val="18"/>
               </w:rPr>
-              <w:t>대표 미션</w:t>
-            </w:r>
-          </w:p>
-        </w:tc>
-      </w:tr>
-      <w:tr>
-        <w:trPr>
-          <w:cantSplit/>
-        </w:trPr>
-        <w:tc>
-          <w:tcPr>
-            <w:tcW w:type="dxa" w:w="900"/>
-            <w:vAlign w:val="center"/>
-          </w:tcPr>
-          <w:p>
-            <w:pPr>
-              <w:spacing w:before="0" w:after="0" w:line="276" w:lineRule="auto"/>
-              <w:jc w:val="left"/>
-            </w:pPr>
-            <w:r/>
-            <w:r>
-              <w:rPr>
-                <w:rFonts w:ascii="Apple SD Gothic Neo" w:hAnsi="Apple SD Gothic Neo" w:eastAsia="Apple SD Gothic Neo"/>
-                <w:b w:val="0"/>
-                <w:color w:val="17211D"/>
-                <w:sz w:val="18"/>
-              </w:rPr>
-              <w:t>0</w:t>
-            </w:r>
-          </w:p>
-        </w:tc>
-        <w:tc>
-          <w:tcPr>
-            <w:tcW w:type="dxa" w:w="2300"/>
-            <w:vAlign w:val="center"/>
-          </w:tcPr>
-          <w:p>
-            <w:pPr>
-              <w:spacing w:before="0" w:after="0" w:line="276" w:lineRule="auto"/>
-              <w:jc w:val="left"/>
-            </w:pPr>
-            <w:r/>
-            <w:r>
-              <w:rPr>
-                <w:rFonts w:ascii="Apple SD Gothic Neo" w:hAnsi="Apple SD Gothic Neo" w:eastAsia="Apple SD Gothic Neo"/>
-                <w:b w:val="0"/>
-                <w:color w:val="17211D"/>
-                <w:sz w:val="18"/>
-              </w:rPr>
-              <w:t>오늘 컨디션 정리</w:t>
-            </w:r>
-          </w:p>
-        </w:tc>
-        <w:tc>
-          <w:tcPr>
-            <w:tcW w:type="dxa" w:w="6160"/>
-            <w:vAlign w:val="center"/>
-          </w:tcPr>
-          <w:p>
-            <w:pPr>
-              <w:spacing w:before="0" w:after="0" w:line="276" w:lineRule="auto"/>
-              <w:jc w:val="left"/>
-            </w:pPr>
-            <w:r/>
-            <w:r>
-              <w:rPr>
-                <w:rFonts w:ascii="Apple SD Gothic Neo" w:hAnsi="Apple SD Gothic Neo" w:eastAsia="Apple SD Gothic Neo"/>
-                <w:b w:val="0"/>
-                <w:color w:val="17211D"/>
-                <w:sz w:val="18"/>
-              </w:rPr>
-              <w:t>오늘 가능한 시간대 고르기, 덜 부담스러운 조건 2개 고르기</w:t>
+              <w:t>사용자가 얻는 것</w:t>
             </w:r>
           </w:p>
         </w:tc>
@@ -700,7 +643,7 @@
         </w:tc>
         <w:tc>
           <w:tcPr>
-            <w:tcW w:type="dxa" w:w="2300"/>
+            <w:tcW w:type="dxa" w:w="3200"/>
             <w:vAlign w:val="center"/>
           </w:tcPr>
           <w:p>
@@ -716,13 +659,13 @@
                 <w:color w:val="17211D"/>
                 <w:sz w:val="18"/>
               </w:rPr>
-              <w:t>비대면 준비</w:t>
+              <w:t>실제 자원 확인</w:t>
             </w:r>
           </w:p>
         </w:tc>
         <w:tc>
           <w:tcPr>
-            <w:tcW w:type="dxa" w:w="6160"/>
+            <w:tcW w:type="dxa" w:w="5260"/>
             <w:vAlign w:val="center"/>
           </w:tcPr>
           <w:p>
@@ -738,7 +681,7 @@
                 <w:color w:val="17211D"/>
                 <w:sz w:val="18"/>
               </w:rPr>
-              <w:t>문의 문장 초안 작성, 방문 전 체크리스트 만들기</w:t>
+              <w:t>인천청년포털, 인천문화재단 등 공식 출처 기반 자원 카드</w:t>
             </w:r>
           </w:p>
         </w:tc>
@@ -771,7 +714,7 @@
         </w:tc>
         <w:tc>
           <w:tcPr>
-            <w:tcW w:type="dxa" w:w="2300"/>
+            <w:tcW w:type="dxa" w:w="3200"/>
             <w:vAlign w:val="center"/>
           </w:tcPr>
           <w:p>
@@ -787,13 +730,13 @@
                 <w:color w:val="17211D"/>
                 <w:sz w:val="18"/>
               </w:rPr>
-              <w:t>동선 계획</w:t>
+              <w:t>조건 줄이기</w:t>
             </w:r>
           </w:p>
         </w:tc>
         <w:tc>
           <w:tcPr>
-            <w:tcW w:type="dxa" w:w="6160"/>
+            <w:tcW w:type="dxa" w:w="5260"/>
             <w:vAlign w:val="center"/>
           </w:tcPr>
           <w:p>
@@ -809,7 +752,7 @@
                 <w:color w:val="17211D"/>
                 <w:sz w:val="18"/>
               </w:rPr>
-              <w:t>운영시간과 마감시간 정리, 가장 짧은 이동 동선 고르기</w:t>
+              <w:t>구/군, 비용, 최대 부담도, 온라인 확인 가능 여부로 후보 축소</w:t>
             </w:r>
           </w:p>
         </w:tc>
@@ -842,7 +785,7 @@
         </w:tc>
         <w:tc>
           <w:tcPr>
-            <w:tcW w:type="dxa" w:w="2300"/>
+            <w:tcW w:type="dxa" w:w="3200"/>
             <w:vAlign w:val="center"/>
           </w:tcPr>
           <w:p>
@@ -858,13 +801,13 @@
                 <w:color w:val="17211D"/>
                 <w:sz w:val="18"/>
               </w:rPr>
-              <w:t>낮은 부담의 짧은 외출</w:t>
+              <w:t>다음 행동 정하기</w:t>
             </w:r>
           </w:p>
         </w:tc>
         <w:tc>
           <w:tcPr>
-            <w:tcW w:type="dxa" w:w="6160"/>
+            <w:tcW w:type="dxa" w:w="5260"/>
             <w:vAlign w:val="center"/>
           </w:tcPr>
           <w:p>
@@ -880,291 +823,59 @@
                 <w:color w:val="17211D"/>
                 <w:sz w:val="18"/>
               </w:rPr>
-              <w:t>도서관 근처까지 가보기, 청년공간 주변 산책</w:t>
+              <w:t>공식 페이지 확인, 조건 1줄 정리, 문의처 메모 같은 오늘의 최소 행동</w:t>
             </w:r>
           </w:p>
         </w:tc>
       </w:tr>
+    </w:tbl>
+    <w:p>
+      <w:pPr>
+        <w:spacing w:before="0" w:after="80" w:line="300" w:lineRule="auto"/>
+      </w:pPr>
+    </w:p>
+    <w:tbl>
+      <w:tblPr>
+        <w:tblW w:type="auto" w:w="0"/>
+        <w:jc w:val="left"/>
+        <w:tblLayout w:type="fixed"/>
+        <w:tblLook w:firstColumn="1" w:firstRow="1" w:lastColumn="0" w:lastRow="0" w:noHBand="0" w:noVBand="1" w:val="04A0"/>
+      </w:tblPr>
+      <w:tblGrid>
+        <w:gridCol w:w="9360"/>
+      </w:tblGrid>
       <w:tr>
-        <w:trPr>
-          <w:cantSplit/>
-        </w:trPr>
         <w:tc>
           <w:tcPr>
-            <w:tcW w:type="dxa" w:w="900"/>
-            <w:vAlign w:val="center"/>
+            <w:tcW w:type="dxa" w:w="9360"/>
+            <w:shd w:fill="FFF3D8"/>
           </w:tcPr>
           <w:p>
             <w:pPr>
-              <w:spacing w:before="0" w:after="0" w:line="276" w:lineRule="auto"/>
-              <w:jc w:val="left"/>
+              <w:spacing w:before="0" w:after="40" w:line="276" w:lineRule="auto"/>
             </w:pPr>
             <w:r/>
             <w:r>
               <w:rPr>
                 <w:rFonts w:ascii="Apple SD Gothic Neo" w:hAnsi="Apple SD Gothic Neo" w:eastAsia="Apple SD Gothic Neo"/>
-                <w:b w:val="0"/>
-                <w:color w:val="17211D"/>
-                <w:sz w:val="18"/>
+                <w:b/>
+                <w:color w:val="0F766E"/>
+                <w:sz w:val="21"/>
               </w:rPr>
-              <w:t>4</w:t>
+              <w:t>사용자 화면에서 숨기는 정보</w:t>
             </w:r>
           </w:p>
-        </w:tc>
-        <w:tc>
-          <w:tcPr>
-            <w:tcW w:type="dxa" w:w="2300"/>
-            <w:vAlign w:val="center"/>
-          </w:tcPr>
           <w:p>
             <w:pPr>
               <w:spacing w:before="0" w:after="0" w:line="276" w:lineRule="auto"/>
-              <w:jc w:val="left"/>
             </w:pPr>
-            <w:r/>
             <w:r>
               <w:rPr>
                 <w:rFonts w:ascii="Apple SD Gothic Neo" w:hAnsi="Apple SD Gothic Neo" w:eastAsia="Apple SD Gothic Neo"/>
-                <w:b w:val="0"/>
                 <w:color w:val="17211D"/>
-                <w:sz w:val="18"/>
+                <w:sz w:val="19"/>
               </w:rPr>
-              <w:t>저부담 참여</w:t>
-            </w:r>
-          </w:p>
-        </w:tc>
-        <w:tc>
-          <w:tcPr>
-            <w:tcW w:type="dxa" w:w="6160"/>
-            <w:vAlign w:val="center"/>
-          </w:tcPr>
-          <w:p>
-            <w:pPr>
-              <w:spacing w:before="0" w:after="0" w:line="276" w:lineRule="auto"/>
-              <w:jc w:val="left"/>
-            </w:pPr>
-            <w:r/>
-            <w:r>
-              <w:rPr>
-                <w:rFonts w:ascii="Apple SD Gothic Neo" w:hAnsi="Apple SD Gothic Neo" w:eastAsia="Apple SD Gothic Neo"/>
-                <w:b w:val="0"/>
-                <w:color w:val="17211D"/>
-                <w:sz w:val="18"/>
-              </w:rPr>
-              <w:t>무료 전시 20분 관람, 도서관 자료실 방문</w:t>
-            </w:r>
-          </w:p>
-        </w:tc>
-      </w:tr>
-      <w:tr>
-        <w:trPr>
-          <w:cantSplit/>
-        </w:trPr>
-        <w:tc>
-          <w:tcPr>
-            <w:tcW w:type="dxa" w:w="900"/>
-            <w:vAlign w:val="center"/>
-          </w:tcPr>
-          <w:p>
-            <w:pPr>
-              <w:spacing w:before="0" w:after="0" w:line="276" w:lineRule="auto"/>
-              <w:jc w:val="left"/>
-            </w:pPr>
-            <w:r/>
-            <w:r>
-              <w:rPr>
-                <w:rFonts w:ascii="Apple SD Gothic Neo" w:hAnsi="Apple SD Gothic Neo" w:eastAsia="Apple SD Gothic Neo"/>
-                <w:b w:val="0"/>
-                <w:color w:val="17211D"/>
-                <w:sz w:val="18"/>
-              </w:rPr>
-              <w:t>5</w:t>
-            </w:r>
-          </w:p>
-        </w:tc>
-        <w:tc>
-          <w:tcPr>
-            <w:tcW w:type="dxa" w:w="2300"/>
-            <w:vAlign w:val="center"/>
-          </w:tcPr>
-          <w:p>
-            <w:pPr>
-              <w:spacing w:before="0" w:after="0" w:line="276" w:lineRule="auto"/>
-              <w:jc w:val="left"/>
-            </w:pPr>
-            <w:r/>
-            <w:r>
-              <w:rPr>
-                <w:rFonts w:ascii="Apple SD Gothic Neo" w:hAnsi="Apple SD Gothic Neo" w:eastAsia="Apple SD Gothic Neo"/>
-                <w:b w:val="0"/>
-                <w:color w:val="17211D"/>
-                <w:sz w:val="18"/>
-              </w:rPr>
-              <w:t>관심 기반 기록</w:t>
-            </w:r>
-          </w:p>
-        </w:tc>
-        <w:tc>
-          <w:tcPr>
-            <w:tcW w:type="dxa" w:w="6160"/>
-            <w:vAlign w:val="center"/>
-          </w:tcPr>
-          <w:p>
-            <w:pPr>
-              <w:spacing w:before="0" w:after="0" w:line="276" w:lineRule="auto"/>
-              <w:jc w:val="left"/>
-            </w:pPr>
-            <w:r/>
-            <w:r>
-              <w:rPr>
-                <w:rFonts w:ascii="Apple SD Gothic Neo" w:hAnsi="Apple SD Gothic Neo" w:eastAsia="Apple SD Gothic Neo"/>
-                <w:b w:val="0"/>
-                <w:color w:val="17211D"/>
-                <w:sz w:val="18"/>
-              </w:rPr>
-              <w:t>전시 후기 5줄 작성, 프로그램 비교하기</w:t>
-            </w:r>
-          </w:p>
-        </w:tc>
-      </w:tr>
-      <w:tr>
-        <w:trPr>
-          <w:cantSplit/>
-        </w:trPr>
-        <w:tc>
-          <w:tcPr>
-            <w:tcW w:type="dxa" w:w="900"/>
-            <w:vAlign w:val="center"/>
-          </w:tcPr>
-          <w:p>
-            <w:pPr>
-              <w:spacing w:before="0" w:after="0" w:line="276" w:lineRule="auto"/>
-              <w:jc w:val="left"/>
-            </w:pPr>
-            <w:r/>
-            <w:r>
-              <w:rPr>
-                <w:rFonts w:ascii="Apple SD Gothic Neo" w:hAnsi="Apple SD Gothic Neo" w:eastAsia="Apple SD Gothic Neo"/>
-                <w:b w:val="0"/>
-                <w:color w:val="17211D"/>
-                <w:sz w:val="18"/>
-              </w:rPr>
-              <w:t>6</w:t>
-            </w:r>
-          </w:p>
-        </w:tc>
-        <w:tc>
-          <w:tcPr>
-            <w:tcW w:type="dxa" w:w="2300"/>
-            <w:vAlign w:val="center"/>
-          </w:tcPr>
-          <w:p>
-            <w:pPr>
-              <w:spacing w:before="0" w:after="0" w:line="276" w:lineRule="auto"/>
-              <w:jc w:val="left"/>
-            </w:pPr>
-            <w:r/>
-            <w:r>
-              <w:rPr>
-                <w:rFonts w:ascii="Apple SD Gothic Neo" w:hAnsi="Apple SD Gothic Neo" w:eastAsia="Apple SD Gothic Neo"/>
-                <w:b w:val="0"/>
-                <w:color w:val="17211D"/>
-                <w:sz w:val="18"/>
-              </w:rPr>
-              <w:t>작은 결과물 만들기</w:t>
-            </w:r>
-          </w:p>
-        </w:tc>
-        <w:tc>
-          <w:tcPr>
-            <w:tcW w:type="dxa" w:w="6160"/>
-            <w:vAlign w:val="center"/>
-          </w:tcPr>
-          <w:p>
-            <w:pPr>
-              <w:spacing w:before="0" w:after="0" w:line="276" w:lineRule="auto"/>
-              <w:jc w:val="left"/>
-            </w:pPr>
-            <w:r/>
-            <w:r>
-              <w:rPr>
-                <w:rFonts w:ascii="Apple SD Gothic Neo" w:hAnsi="Apple SD Gothic Neo" w:eastAsia="Apple SD Gothic Neo"/>
-                <w:b w:val="0"/>
-                <w:color w:val="17211D"/>
-                <w:sz w:val="18"/>
-              </w:rPr>
-              <w:t>지역 축제 카드뉴스 초안, 개선 제안 1쪽</w:t>
-            </w:r>
-          </w:p>
-        </w:tc>
-      </w:tr>
-      <w:tr>
-        <w:trPr>
-          <w:cantSplit/>
-        </w:trPr>
-        <w:tc>
-          <w:tcPr>
-            <w:tcW w:type="dxa" w:w="900"/>
-            <w:vAlign w:val="center"/>
-          </w:tcPr>
-          <w:p>
-            <w:pPr>
-              <w:spacing w:before="0" w:after="0" w:line="276" w:lineRule="auto"/>
-              <w:jc w:val="left"/>
-            </w:pPr>
-            <w:r/>
-            <w:r>
-              <w:rPr>
-                <w:rFonts w:ascii="Apple SD Gothic Neo" w:hAnsi="Apple SD Gothic Neo" w:eastAsia="Apple SD Gothic Neo"/>
-                <w:b w:val="0"/>
-                <w:color w:val="17211D"/>
-                <w:sz w:val="18"/>
-              </w:rPr>
-              <w:t>7</w:t>
-            </w:r>
-          </w:p>
-        </w:tc>
-        <w:tc>
-          <w:tcPr>
-            <w:tcW w:type="dxa" w:w="2300"/>
-            <w:vAlign w:val="center"/>
-          </w:tcPr>
-          <w:p>
-            <w:pPr>
-              <w:spacing w:before="0" w:after="0" w:line="276" w:lineRule="auto"/>
-              <w:jc w:val="left"/>
-            </w:pPr>
-            <w:r/>
-            <w:r>
-              <w:rPr>
-                <w:rFonts w:ascii="Apple SD Gothic Neo" w:hAnsi="Apple SD Gothic Neo" w:eastAsia="Apple SD Gothic Neo"/>
-                <w:b w:val="0"/>
-                <w:color w:val="17211D"/>
-                <w:sz w:val="18"/>
-              </w:rPr>
-              <w:t>지원 연결 준비</w:t>
-            </w:r>
-          </w:p>
-        </w:tc>
-        <w:tc>
-          <w:tcPr>
-            <w:tcW w:type="dxa" w:w="6160"/>
-            <w:vAlign w:val="center"/>
-          </w:tcPr>
-          <w:p>
-            <w:pPr>
-              <w:spacing w:before="0" w:after="0" w:line="276" w:lineRule="auto"/>
-              <w:jc w:val="left"/>
-            </w:pPr>
-            <w:r/>
-            <w:r>
-              <w:rPr>
-                <w:rFonts w:ascii="Apple SD Gothic Neo" w:hAnsi="Apple SD Gothic Neo" w:eastAsia="Apple SD Gothic Neo"/>
-                <w:b w:val="0"/>
-                <w:color w:val="17211D"/>
-                <w:sz w:val="18"/>
-              </w:rPr>
-              <w:t>직무훈련 상담 질문 정리, 상담 전 질문 준비</w:t>
+              <w:t>resource_id, mission_id, ranking score, RAG score, stage 번호, reboot point, model metric, raw payload는 사용자 카드에 표시하지 않습니다. 이 정보는 운영자 탭과 API 응답에서만 내부 검증용으로 확인합니다.</w:t>
             </w:r>
           </w:p>
         </w:tc>
@@ -1351,7 +1062,7 @@
                 <w:color w:val="17211D"/>
                 <w:sz w:val="18"/>
               </w:rPr>
-              <w:t>Mock/Public 후보 데이터</w:t>
+              <w:t>Sample data + official resource seed</w:t>
             </w:r>
           </w:p>
         </w:tc>
@@ -1395,7 +1106,7 @@
                 <w:color w:val="17211D"/>
                 <w:sz w:val="18"/>
               </w:rPr>
-              <w:t>프로필, 미션, 자원, 진행 로그 샘플 생성</w:t>
+              <w:t>Synthetic profile/progress와 공식 출처 기반 인천 자원 seed 생성</w:t>
             </w:r>
           </w:p>
         </w:tc>
@@ -1674,7 +1385,7 @@
                 <w:color w:val="17211D"/>
                 <w:sz w:val="18"/>
               </w:rPr>
-              <w:t>TF-IDF 기반 인천 정책/문화 자원 검색</w:t>
+              <w:t>TF-IDF 기반 공식 자원 검색</w:t>
             </w:r>
           </w:p>
         </w:tc>
@@ -1953,7 +1664,7 @@
                 <w:color w:val="17211D"/>
                 <w:sz w:val="18"/>
               </w:rPr>
-              <w:t>FastAPI와 Streamlit 사용자/연구자 화면</w:t>
+              <w:t>FastAPI와 Streamlit 사용자/운영자 화면</w:t>
             </w:r>
           </w:p>
         </w:tc>
@@ -2523,7 +2234,7 @@
                 <w:color w:val="17211D"/>
                 <w:sz w:val="18"/>
               </w:rPr>
-              <w:t>Streamlit 대시보드. 사용자 데모와 운영자·연구자 뷰 분리</w:t>
+              <w:t>Streamlit 대시보드. 오늘 순서, 인천 자원 검색, 운영자, 평가 탭</w:t>
             </w:r>
           </w:p>
         </w:tc>
@@ -2572,7 +2283,7 @@
                 <w:color w:val="17211D"/>
                 <w:sz w:val="18"/>
               </w:rPr>
-              <w:t>mock data 생성, fetch adapter stub, validation</w:t>
+              <w:t>Synthetic sample 생성, 공식 resource seed 생성, validation</w:t>
             </w:r>
           </w:p>
         </w:tc>
@@ -3171,7 +2882,7 @@
                 <w:color w:val="17211D"/>
                 <w:sz w:val="18"/>
               </w:rPr>
-              <w:t>청년/문화/지원/공모전/미니프로젝트 자원 80개</w:t>
+              <w:t>공식 출처 기반 인천 자원 seed</w:t>
             </w:r>
           </w:p>
         </w:tc>
@@ -3193,7 +2904,7 @@
                 <w:color w:val="17211D"/>
                 <w:sz w:val="18"/>
               </w:rPr>
-              <w:t>mock_incheon_public_data source</w:t>
+              <w:t>인천청년포털, 인천문화재단, 인천아트플랫폼, 트라이보울 등</w:t>
             </w:r>
           </w:p>
         </w:tc>
@@ -3799,7 +3510,7 @@
           <w:color w:val="0F766E"/>
           <w:sz w:val="26"/>
         </w:rPr>
-        <w:t>6.1 Rule 기반 stage 분류</w:t>
+        <w:t>6.1 사용자 화면 정렬</w:t>
       </w:r>
     </w:p>
     <w:p>
@@ -3812,7 +3523,49 @@
           <w:b w:val="0"/>
           <w:color w:val="17211D"/>
         </w:rPr>
-        <w:t>stage_rules.py는 외출 부담, 대면 부담, 에너지, 생활 리듬, 취업 부담, 지원자 존재 여부, 과거 진행 로그를 사용해 Stage 0-7을 정합니다. 추천의 1차 기준은 이 rule입니다. ML stage model은 보조 stage와 contributing factor 설명용입니다.</w:t>
+        <w:t>현재 사용자 화면은 실제 사용자 profile을 요구하지 않습니다. 공식 자원 자체의 비용, 부담도, 온라인 확인 가능 여부, 예상 확인 시간을 기준으로 자원을 정렬하고, 가장 부담이 낮은 후보를 기준으로 오늘의 다음 행동을 만듭니다.</w:t>
+      </w:r>
+    </w:p>
+    <w:p>
+      <w:pPr>
+        <w:pStyle w:val="ListBullet"/>
+        <w:spacing w:before="0" w:after="80" w:line="300" w:lineRule="auto"/>
+        <w:ind w:left="547" w:hanging="274"/>
+      </w:pPr>
+      <w:r>
+        <w:rPr>
+          <w:rFonts w:ascii="Apple SD Gothic Neo" w:hAnsi="Apple SD Gothic Neo" w:eastAsia="Apple SD Gothic Neo"/>
+          <w:color w:val="17211D"/>
+        </w:rPr>
+        <w:t>정렬 기준: burden_level 낮음, cost_type 낮음, online_available 우선, estimated_duration_minutes 짧음, 이름 순</w:t>
+      </w:r>
+    </w:p>
+    <w:p>
+      <w:pPr>
+        <w:pStyle w:val="ListBullet"/>
+        <w:spacing w:before="0" w:after="80" w:line="300" w:lineRule="auto"/>
+        <w:ind w:left="547" w:hanging="274"/>
+      </w:pPr>
+      <w:r>
+        <w:rPr>
+          <w:rFonts w:ascii="Apple SD Gothic Neo" w:hAnsi="Apple SD Gothic Neo" w:eastAsia="Apple SD Gothic Neo"/>
+          <w:color w:val="17211D"/>
+        </w:rPr>
+        <w:t>다음 행동: 공식 페이지 열기, 대상·비용·운영시간 확인, 문의처 메모, 조건 1줄 정리</w:t>
+      </w:r>
+    </w:p>
+    <w:p>
+      <w:pPr>
+        <w:pStyle w:val="ListBullet"/>
+        <w:spacing w:before="0" w:after="80" w:line="300" w:lineRule="auto"/>
+        <w:ind w:left="547" w:hanging="274"/>
+      </w:pPr>
+      <w:r>
+        <w:rPr>
+          <w:rFonts w:ascii="Apple SD Gothic Neo" w:hAnsi="Apple SD Gothic Neo" w:eastAsia="Apple SD Gothic Neo"/>
+          <w:color w:val="17211D"/>
+        </w:rPr>
+        <w:t>사용자 카드에는 내부 score와 ID를 표시하지 않습니다.</w:t>
       </w:r>
     </w:p>
     <w:p>
@@ -3827,7 +3580,35 @@
           <w:color w:val="0F766E"/>
           <w:sz w:val="26"/>
         </w:rPr>
-        <w:t>6.2 Mission ranking</w:t>
+        <w:t>6.2 Rule 기반 stage 분류</w:t>
+      </w:r>
+    </w:p>
+    <w:p>
+      <w:pPr>
+        <w:spacing w:before="0" w:after="120" w:line="300" w:lineRule="auto"/>
+      </w:pPr>
+      <w:r>
+        <w:rPr>
+          <w:rFonts w:ascii="Apple SD Gothic Neo" w:hAnsi="Apple SD Gothic Neo" w:eastAsia="Apple SD Gothic Neo"/>
+          <w:b w:val="0"/>
+          <w:color w:val="17211D"/>
+        </w:rPr>
+        <w:t>stage_rules.py는 API와 운영자 점검용으로 남아 있습니다. 외출 부담, 대면 부담, 에너지, 생활 리듬, 취업 부담, 지원자 존재 여부, 과거 진행 로그를 사용해 Stage 0-7을 정합니다. 추천의 1차 기준은 rule이며 ML stage model은 보조 stage와 contributing factor 설명용입니다.</w:t>
+      </w:r>
+    </w:p>
+    <w:p>
+      <w:pPr>
+        <w:pStyle w:val="Heading2"/>
+        <w:spacing w:before="200" w:after="120" w:line="300" w:lineRule="auto"/>
+      </w:pPr>
+      <w:r>
+        <w:rPr>
+          <w:rFonts w:ascii="Apple SD Gothic Neo" w:hAnsi="Apple SD Gothic Neo" w:eastAsia="Apple SD Gothic Neo"/>
+          <w:b/>
+          <w:color w:val="0F766E"/>
+          <w:sz w:val="26"/>
+        </w:rPr>
+        <w:t>6.3 Mission ranking</w:t>
       </w:r>
     </w:p>
     <w:p>
@@ -3940,7 +3721,7 @@
           <w:color w:val="0F766E"/>
           <w:sz w:val="26"/>
         </w:rPr>
-        <w:t>6.3 Resource ranking</w:t>
+        <w:t>6.4 Resource ranking</w:t>
       </w:r>
     </w:p>
     <w:p>
@@ -4029,6 +3810,20 @@
     </w:p>
     <w:p>
       <w:pPr>
+        <w:pStyle w:val="ListBullet"/>
+        <w:spacing w:before="0" w:after="80" w:line="300" w:lineRule="auto"/>
+        <w:ind w:left="547" w:hanging="274"/>
+      </w:pPr>
+      <w:r>
+        <w:rPr>
+          <w:rFonts w:ascii="Apple SD Gothic Neo" w:hAnsi="Apple SD Gothic Neo" w:eastAsia="Apple SD Gothic Neo"/>
+          <w:color w:val="17211D"/>
+        </w:rPr>
+        <w:t>이 점수는 운영자 점검용이며 사용자 화면에는 표시하지 않습니다.</w:t>
+      </w:r>
+    </w:p>
+    <w:p>
+      <w:pPr>
         <w:pStyle w:val="Heading1"/>
         <w:spacing w:before="280" w:after="120" w:line="300" w:lineRule="auto"/>
       </w:pPr>
@@ -4066,7 +3861,7 @@
           <w:rFonts w:ascii="Apple SD Gothic Neo" w:hAnsi="Apple SD Gothic Neo" w:eastAsia="Apple SD Gothic Neo"/>
           <w:color w:val="17211D"/>
         </w:rPr>
-        <w:t>기본 검색 대상은 youth_program, culture_event, culture_facility, support_program입니다.</w:t>
+        <w:t>기본 검색 대상은 youth_program, culture_event, culture_facility, support_program, contest, mini_project입니다.</w:t>
       </w:r>
     </w:p>
     <w:p>
@@ -4122,7 +3917,7 @@
           <w:rFonts w:ascii="Apple SD Gothic Neo" w:hAnsi="Apple SD Gothic Neo" w:eastAsia="Apple SD Gothic Neo"/>
           <w:color w:val="17211D"/>
         </w:rPr>
-        <w:t>사용자 화면에서는 자원명, 구/군, 비용, 부담도만 보여주고 score/id/source key는 숨깁니다.</w:t>
+        <w:t>사용자 화면에서는 자원명, 설명, 구/군, 비용, 부담도, 주소, 문의처, 공식 출처 링크만 보여주고 score/id/source key는 숨깁니다.</w:t>
       </w:r>
     </w:p>
     <w:p>
@@ -4444,7 +4239,7 @@
           <w:b w:val="0"/>
           <w:color w:val="17211D"/>
         </w:rPr>
-        <w:t>현재 데이터 루프는 사용자 상태 입력 → safety guardrail → stage 분류 → RAG/mission/resource 추천 → feedback/progress log → human evaluation → batch retraining입니다. 초기에는 실제 사용자 데이터가 없으므로 closed-loop A/B test를 하지 않습니다.</w:t>
+        <w:t>현재 운영 전 데이터 루프 설계는 상태 입력 → safety guardrail → stage 분류 → RAG/mission/resource 추천 → feedback/progress log → human evaluation → batch retraining입니다. 다만 실제 사용자 데이터를 확보할 수 없으므로, 사용자-facing 데모에서는 개인정보성 상태 입력을 제외하고 공식 자원 확인 흐름을 우선합니다.</w:t>
       </w:r>
     </w:p>
     <w:tbl>
@@ -4884,7 +4679,7 @@
                 <w:color w:val="17211D"/>
                 <w:sz w:val="18"/>
               </w:rPr>
-              <w:t>사용자 데모</w:t>
+              <w:t>오늘 순서</w:t>
             </w:r>
           </w:p>
         </w:tc>
@@ -4928,7 +4723,7 @@
                 <w:color w:val="17211D"/>
                 <w:sz w:val="18"/>
               </w:rPr>
-              <w:t>상태 입력과 추천 결과를 한 화면에 표시. 미션 ID, score, Stage 번호, point 숨김. 시작/완료/나중에/너무 어려움 action 제공</w:t>
+              <w:t>공식 자원 확인 → 조건 줄이기 → 오늘의 최소 행동 제안. ID, score, stage, point 숨김</w:t>
             </w:r>
           </w:p>
         </w:tc>
@@ -4955,7 +4750,7 @@
                 <w:color w:val="17211D"/>
                 <w:sz w:val="18"/>
               </w:rPr>
-              <w:t>정책/문화 찾기</w:t>
+              <w:t>인천 자원 검색</w:t>
             </w:r>
           </w:p>
         </w:tc>
@@ -4999,7 +4794,7 @@
                 <w:color w:val="17211D"/>
                 <w:sz w:val="18"/>
               </w:rPr>
-              <w:t>RAG 검색 결과를 자원 정보 중심으로 표시. source key, resource id, rag score 숨김</w:t>
+              <w:t>RAG 검색 결과를 자원 카드와 공식 출처 링크 중심으로 표시. resource id, rag score 숨김</w:t>
             </w:r>
           </w:p>
         </w:tc>
@@ -5026,7 +4821,7 @@
                 <w:color w:val="17211D"/>
                 <w:sz w:val="18"/>
               </w:rPr>
-              <w:t>운영자·연구자 뷰</w:t>
+              <w:t>운영자</w:t>
             </w:r>
           </w:p>
         </w:tc>
@@ -5048,7 +4843,7 @@
                 <w:color w:val="17211D"/>
                 <w:sz w:val="18"/>
               </w:rPr>
-              <w:t>발표자/연구자/운영자</w:t>
+              <w:t>발표자/운영자</w:t>
             </w:r>
           </w:p>
         </w:tc>
@@ -5097,7 +4892,7 @@
                 <w:color w:val="17211D"/>
                 <w:sz w:val="18"/>
               </w:rPr>
-              <w:t>MLOps·평가</w:t>
+              <w:t>평가</w:t>
             </w:r>
           </w:p>
         </w:tc>
@@ -5119,7 +4914,7 @@
                 <w:color w:val="17211D"/>
                 <w:sz w:val="18"/>
               </w:rPr>
-              <w:t>발표자/연구자</w:t>
+              <w:t>발표자/운영자</w:t>
             </w:r>
           </w:p>
         </w:tc>
@@ -5163,7 +4958,7 @@
           <w:rFonts w:ascii="Apple SD Gothic Neo" w:hAnsi="Apple SD Gothic Neo" w:eastAsia="Apple SD Gothic Neo"/>
           <w:color w:val="17211D"/>
         </w:rPr>
-        <w:t>입력 widget 값은 session state에 저장되고, profile signature가 바뀌면 analyze_profile을 자동 재계산합니다.</w:t>
+        <w:t>첫 화면에서 나이, 부담도, 자유입력 등 개인정보성 demo profile 입력을 제거했습니다.</w:t>
       </w:r>
     </w:p>
     <w:p>
@@ -5177,7 +4972,7 @@
           <w:rFonts w:ascii="Apple SD Gothic Neo" w:hAnsi="Apple SD Gothic Neo" w:eastAsia="Apple SD Gothic Neo"/>
           <w:color w:val="17211D"/>
         </w:rPr>
-        <w:t>기존처럼 intake demo에서 submit한 뒤 별도 추천 루트 탭을 눌러야 확인하는 구조를 제거했습니다.</w:t>
+        <w:t>필터 변경 즉시 결과와 다음 행동이 갱신됩니다.</w:t>
       </w:r>
     </w:p>
     <w:p>
@@ -5191,7 +4986,7 @@
           <w:rFonts w:ascii="Apple SD Gothic Neo" w:hAnsi="Apple SD Gothic Neo" w:eastAsia="Apple SD Gothic Neo"/>
           <w:color w:val="17211D"/>
         </w:rPr>
-        <w:t>demo_user_id를 session state에 고정해 feedback/progress log가 같은 데모 사용자에 누적됩니다.</w:t>
+        <w:t>저장/북마크/정보접촉 같은 의미 낮은 행동은 사용자 화면에서 제거했습니다.</w:t>
       </w:r>
     </w:p>
     <w:p>
@@ -5205,7 +5000,21 @@
           <w:rFonts w:ascii="Apple SD Gothic Neo" w:hAnsi="Apple SD Gothic Neo" w:eastAsia="Apple SD Gothic Neo"/>
           <w:color w:val="17211D"/>
         </w:rPr>
-        <w:t>사용자 화면에는 내부 ranking score, 식별자, Stage 번호, point를 숨기고, 연구자 탭에서만 표로 공개합니다.</w:t>
+        <w:t>사용자 화면에는 내부 ranking score, 식별자, Stage 번호, point를 숨기고, 운영자 탭에서만 표로 공개합니다.</w:t>
+      </w:r>
+    </w:p>
+    <w:p>
+      <w:pPr>
+        <w:pStyle w:val="ListBullet"/>
+        <w:spacing w:before="0" w:after="80" w:line="300" w:lineRule="auto"/>
+        <w:ind w:left="547" w:hanging="274"/>
+      </w:pPr>
+      <w:r>
+        <w:rPr>
+          <w:rFonts w:ascii="Apple SD Gothic Neo" w:hAnsi="Apple SD Gothic Neo" w:eastAsia="Apple SD Gothic Neo"/>
+          <w:color w:val="17211D"/>
+        </w:rPr>
+        <w:t>모바일 폭에서는 단계 안내와 필터/카드가 한 열로 쌓이도록 반응형 CSS를 적용했습니다.</w:t>
       </w:r>
     </w:p>
     <w:p>
@@ -6804,7 +6613,7 @@
                 <w:color w:val="17211D"/>
                 <w:sz w:val="18"/>
               </w:rPr>
-              <w:t>mock data 생성, validation, feature build, model training, DB init, reports 생성</w:t>
+              <w:t>synthetic sample과 공식 resource seed 생성, validation, feature build, model training, DB init, reports 생성</w:t>
             </w:r>
           </w:p>
         </w:tc>
@@ -7100,7 +6909,7 @@
           <w:rFonts w:ascii="Apple SD Gothic Neo" w:hAnsi="Apple SD Gothic Neo" w:eastAsia="Apple SD Gothic Neo"/>
           <w:color w:val="17211D"/>
         </w:rPr>
-        <w:t>사용자 데모 탭에서 기본 profile을 보여주고 시작점과 오늘의 미션을 설명한다.</w:t>
+        <w:t>오늘 순서 탭에서 공식 자원 카드와 세 단계 흐름을 보여준다.</w:t>
       </w:r>
     </w:p>
     <w:p>
@@ -7114,7 +6923,7 @@
           <w:rFonts w:ascii="Apple SD Gothic Neo" w:hAnsi="Apple SD Gothic Neo" w:eastAsia="Apple SD Gothic Neo"/>
           <w:color w:val="17211D"/>
         </w:rPr>
-        <w:t>외출 부담, 대면 부담, 에너지, 생활 리듬 값을 바꿔 추천이 즉시 바뀌는 것을 보여준다.</w:t>
+        <w:t>자원 종류, 구/군, 비용, 최대 부담도, 온라인 확인 가능 여부를 바꿔 결과가 즉시 바뀌는 것을 보여준다.</w:t>
       </w:r>
     </w:p>
     <w:p>
@@ -7128,7 +6937,7 @@
           <w:rFonts w:ascii="Apple SD Gothic Neo" w:hAnsi="Apple SD Gothic Neo" w:eastAsia="Apple SD Gothic Neo"/>
           <w:color w:val="17211D"/>
         </w:rPr>
-        <w:t>미션의 시작/완료/너무 어려움 버튼을 눌러 feedback/progress log가 남는 것을 보여준다.</w:t>
+        <w:t>오늘의 가장 작은 행동이 신청/방문 강요가 아니라 공식 페이지 확인과 조건 1줄 정리임을 설명한다.</w:t>
       </w:r>
     </w:p>
     <w:p>
@@ -7142,7 +6951,7 @@
           <w:rFonts w:ascii="Apple SD Gothic Neo" w:hAnsi="Apple SD Gothic Neo" w:eastAsia="Apple SD Gothic Neo"/>
           <w:color w:val="17211D"/>
         </w:rPr>
-        <w:t>정책/문화 찾기 탭에서 인천 자원을 검색하고 근거 자료가 표시되는 것을 보여준다.</w:t>
+        <w:t>인천 자원 검색 탭에서 RAG 검색 결과와 공식 출처 링크가 표시되는 것을 보여준다.</w:t>
       </w:r>
     </w:p>
     <w:p>
@@ -7156,7 +6965,7 @@
           <w:rFonts w:ascii="Apple SD Gothic Neo" w:hAnsi="Apple SD Gothic Neo" w:eastAsia="Apple SD Gothic Neo"/>
           <w:color w:val="17211D"/>
         </w:rPr>
-        <w:t>운영자·연구자 뷰에서 mission_id, resource_id, score, raw payload, feedback log를 확인한다.</w:t>
+        <w:t>운영자 탭에서 mission_id, resource_id, score, raw payload, feedback log가 내부 검증용으로만 보이는 것을 확인한다.</w:t>
       </w:r>
     </w:p>
     <w:p>
@@ -7170,7 +6979,7 @@
           <w:rFonts w:ascii="Apple SD Gothic Neo" w:hAnsi="Apple SD Gothic Neo" w:eastAsia="Apple SD Gothic Neo"/>
           <w:color w:val="17211D"/>
         </w:rPr>
-        <w:t>MLOps·평가 탭에서 data version, 모델 metric, human eval sheet, synthetic label warning을 설명한다.</w:t>
+        <w:t>평가 탭에서 data version, 모델 metric, human eval sheet, synthetic label warning을 설명한다.</w:t>
       </w:r>
     </w:p>
     <w:p>
@@ -7184,7 +6993,7 @@
           <w:rFonts w:ascii="Apple SD Gothic Neo" w:hAnsi="Apple SD Gothic Neo" w:eastAsia="Apple SD Gothic Neo"/>
           <w:color w:val="17211D"/>
         </w:rPr>
-        <w:t>안전 분기 입력을 넣으면 일반 미션 추천이 중단되고 도움 연결 자원이 표시되는 것을 짧게 확인한다.</w:t>
+        <w:t>API 문서에서 safety guardrail과 feedback endpoint가 남아 있음을 보여주되, 사용자 화면은 개인정보성 입력을 요구하지 않는다고 설명한다.</w:t>
       </w:r>
     </w:p>
     <w:p>
@@ -7334,7 +7143,7 @@
                 <w:color w:val="17211D"/>
                 <w:sz w:val="18"/>
               </w:rPr>
-              <w:t>mock/public 후보</w:t>
+              <w:t>공식 출처 기반 curated seed</w:t>
             </w:r>
           </w:p>
         </w:tc>
@@ -7356,7 +7165,7 @@
                 <w:color w:val="17211D"/>
                 <w:sz w:val="18"/>
               </w:rPr>
-              <w:t>실제 인천 청년정책, 문화행사, 문화시설, 청년공간 데이터 연동</w:t>
+              <w:t>자동 동기화 또는 운영자 검수형 갱신 프로세스 설계</w:t>
             </w:r>
           </w:p>
         </w:tc>
@@ -7819,7 +7628,21 @@
           <w:rFonts w:ascii="Apple SD Gothic Neo" w:hAnsi="Apple SD Gothic Neo" w:eastAsia="Apple SD Gothic Neo"/>
           <w:color w:val="17211D"/>
         </w:rPr>
-        <w:t>현재 데이터와 label은 MVP 시연용 synthetic/mock data입니다.</w:t>
+        <w:t>현재 사용자 profile과 label은 MVP 시연용 synthetic data입니다.</w:t>
+      </w:r>
+    </w:p>
+    <w:p>
+      <w:pPr>
+        <w:pStyle w:val="ListBullet"/>
+        <w:spacing w:before="0" w:after="80" w:line="300" w:lineRule="auto"/>
+        <w:ind w:left="547" w:hanging="274"/>
+      </w:pPr>
+      <w:r>
+        <w:rPr>
+          <w:rFonts w:ascii="Apple SD Gothic Neo" w:hAnsi="Apple SD Gothic Neo" w:eastAsia="Apple SD Gothic Neo"/>
+          <w:color w:val="17211D"/>
+        </w:rPr>
+        <w:t>현재 resource는 공식 출처 기반 seed이지만 자동 크롤링/공공 API 동기화는 아직 없습니다.</w:t>
       </w:r>
     </w:p>
     <w:p>
@@ -8162,7 +7985,7 @@
                 <w:color w:val="17211D"/>
                 <w:sz w:val="18"/>
               </w:rPr>
-              <w:t>사용자/연구자 분리, 입력 즉시 반영, ID/score 숨김, feedback/progress 저장 구조로 수정</w:t>
+              <w:t>사용자 화면의 개인 상태 입력 제거, 공식 자원 중심 흐름, ID/score 숨김, 모바일/색상 대비 점검</w:t>
             </w:r>
           </w:p>
         </w:tc>

</xml_diff>

<commit_message>
Clarify synthetic labels versus implemented pipeline
</commit_message>
<xml_diff>
--- a/docs/RebootRoute_Project_Report.docx
+++ b/docs/RebootRoute_Project_Report.docx
@@ -6430,7 +6430,7 @@
                 <w:color w:val="17211D"/>
                 <w:sz w:val="19"/>
               </w:rPr>
-              <w:t>현재 label은 실제 참여 결과가 아니라 MVP 시연용 synthetic label입니다. 운영 환경에서는 real program participation, mission completion, support outcome, operator review, user feedback 데이터로 반드시 교체해야 합니다.</w:t>
+              <w:t>현재 학습 label은 사용자 행동과 기관 결과를 대신한 synthetic placeholder입니다. 로그 수집, 운영자 검토, 재학습 구조는 구현되어 있지만, 실제 미션 완료, too-hard 피드백, 프로그램 참여, 지원 결과처럼 관측이 필요한 outcome label은 운영 또는 기관 연계 후 수집·import해야 합니다.</w:t>
             </w:r>
           </w:p>
         </w:tc>
@@ -7192,7 +7192,7 @@
                 <w:color w:val="17211D"/>
                 <w:sz w:val="18"/>
               </w:rPr>
-              <w:t>Outcome label</w:t>
+              <w:t>Outcome label 구조</w:t>
             </w:r>
           </w:p>
         </w:tc>
@@ -7214,7 +7214,7 @@
                 <w:color w:val="17211D"/>
                 <w:sz w:val="18"/>
               </w:rPr>
-              <w:t>synthetic label</w:t>
+              <w:t>schema/API/pipeline 구현</w:t>
             </w:r>
           </w:p>
         </w:tc>
@@ -7236,7 +7236,7 @@
                 <w:color w:val="17211D"/>
                 <w:sz w:val="18"/>
               </w:rPr>
-              <w:t>실제 미션 완료, too-hard, 참여, 제출, 운영자 review label로 교체</w:t>
+              <w:t>실제 사용자 또는 기관 관측 label 수집·import</w:t>
             </w:r>
           </w:p>
         </w:tc>
@@ -7628,7 +7628,7 @@
           <w:rFonts w:ascii="Apple SD Gothic Neo" w:hAnsi="Apple SD Gothic Neo" w:eastAsia="Apple SD Gothic Neo"/>
           <w:color w:val="17211D"/>
         </w:rPr>
-        <w:t>현재 사용자 profile과 label은 MVP 시연용 synthetic data입니다.</w:t>
+        <w:t>현재 사용자 profile과 학습 label은 synthetic placeholder입니다. feedback/progress schema와 pipeline은 구현되어 있으나, 실제 mission completion, too-hard 피드백, 프로그램 참여, 지원 결과 label은 사용자 또는 기관 관측 후 수집·import해야 합니다.</w:t>
       </w:r>
     </w:p>
     <w:p>
@@ -8006,7 +8006,7 @@
           <w:b/>
           <w:color w:val="17211D"/>
         </w:rPr>
-        <w:t>Required original notice: These labels are synthetic MVP labels and must be replaced with real program participation / mission completion / support outcome data before production use.</w:t>
+        <w:t>Required notice: The current training labels are synthetic placeholders for user behavior and institution outcome labels. The pipeline is implemented, but real observed outcome labels must be collected or imported before production use.</w:t>
       </w:r>
     </w:p>
     <w:sectPr>

</xml_diff>

<commit_message>
Implement outcome tracking and location map
</commit_message>
<xml_diff>
--- a/docs/RebootRoute_Project_Report.docx
+++ b/docs/RebootRoute_Project_Report.docx
@@ -524,7 +524,7 @@
           <w:b w:val="0"/>
           <w:color w:val="17211D"/>
         </w:rPr>
-        <w:t>대시보드의 첫 탭은 실제 사용자가 무엇을 먼저 보고 무엇을 얻는지 명확히 알 수 있도록 세 단계로 재구성했습니다. 필터를 변경하면 결과와 다음 행동이 즉시 갱신되며, 별도 업데이트 버튼이나 추천 루트 버튼을 누르지 않습니다.</w:t>
+        <w:t>대시보드의 첫 탭은 실제 사용자가 무엇을 먼저 보고 무엇을 얻는지 명확히 알 수 있도록 네 단계로 재구성했습니다. 조건을 변경하면 추천 루트, 미션, 자원 후보, 지도 위치가 즉시 갱신되며, 별도 업데이트 버튼이나 추천 루트 버튼을 누르지 않습니다.</w:t>
       </w:r>
     </w:p>
     <w:tbl>
@@ -659,7 +659,7 @@
                 <w:color w:val="17211D"/>
                 <w:sz w:val="18"/>
               </w:rPr>
-              <w:t>실제 자원 확인</w:t>
+              <w:t>내 조건 입력</w:t>
             </w:r>
           </w:p>
         </w:tc>
@@ -681,7 +681,7 @@
                 <w:color w:val="17211D"/>
                 <w:sz w:val="18"/>
               </w:rPr>
-              <w:t>인천청년포털, 인천문화재단 등 공식 출처 기반 자원 카드</w:t>
+              <w:t>위치, 외출 가능 시간, 비용, 대면 부담, 관심 분야</w:t>
             </w:r>
           </w:p>
         </w:tc>
@@ -730,7 +730,7 @@
                 <w:color w:val="17211D"/>
                 <w:sz w:val="18"/>
               </w:rPr>
-              <w:t>조건 줄이기</w:t>
+              <w:t>추천 루트 확인</w:t>
             </w:r>
           </w:p>
         </w:tc>
@@ -752,7 +752,7 @@
                 <w:color w:val="17211D"/>
                 <w:sz w:val="18"/>
               </w:rPr>
-              <w:t>구/군, 비용, 최대 부담도, 온라인 확인 가능 여부로 후보 축소</w:t>
+              <w:t>현재 부담도에 맞는 단계와 오늘 할 미션</w:t>
             </w:r>
           </w:p>
         </w:tc>
@@ -801,7 +801,7 @@
                 <w:color w:val="17211D"/>
                 <w:sz w:val="18"/>
               </w:rPr>
-              <w:t>다음 행동 정하기</w:t>
+              <w:t>지도 확인</w:t>
             </w:r>
           </w:p>
         </w:tc>
@@ -823,7 +823,78 @@
                 <w:color w:val="17211D"/>
                 <w:sz w:val="18"/>
               </w:rPr>
-              <w:t>공식 페이지 확인, 조건 1줄 정리, 문의처 메모 같은 오늘의 최소 행동</w:t>
+              <w:t>내 위치와 활동 장소의 상대 위치, 대략 직선거리</w:t>
+            </w:r>
+          </w:p>
+        </w:tc>
+      </w:tr>
+      <w:tr>
+        <w:trPr>
+          <w:cantSplit/>
+        </w:trPr>
+        <w:tc>
+          <w:tcPr>
+            <w:tcW w:type="dxa" w:w="900"/>
+            <w:vAlign w:val="center"/>
+          </w:tcPr>
+          <w:p>
+            <w:pPr>
+              <w:spacing w:before="0" w:after="0" w:line="276" w:lineRule="auto"/>
+              <w:jc w:val="left"/>
+            </w:pPr>
+            <w:r/>
+            <w:r>
+              <w:rPr>
+                <w:rFonts w:ascii="Apple SD Gothic Neo" w:hAnsi="Apple SD Gothic Neo" w:eastAsia="Apple SD Gothic Neo"/>
+                <w:b w:val="0"/>
+                <w:color w:val="17211D"/>
+                <w:sz w:val="18"/>
+              </w:rPr>
+              <w:t>4</w:t>
+            </w:r>
+          </w:p>
+        </w:tc>
+        <w:tc>
+          <w:tcPr>
+            <w:tcW w:type="dxa" w:w="3200"/>
+            <w:vAlign w:val="center"/>
+          </w:tcPr>
+          <w:p>
+            <w:pPr>
+              <w:spacing w:before="0" w:after="0" w:line="276" w:lineRule="auto"/>
+              <w:jc w:val="left"/>
+            </w:pPr>
+            <w:r/>
+            <w:r>
+              <w:rPr>
+                <w:rFonts w:ascii="Apple SD Gothic Neo" w:hAnsi="Apple SD Gothic Neo" w:eastAsia="Apple SD Gothic Neo"/>
+                <w:b w:val="0"/>
+                <w:color w:val="17211D"/>
+                <w:sz w:val="18"/>
+              </w:rPr>
+              <w:t>결과 기록</w:t>
+            </w:r>
+          </w:p>
+        </w:tc>
+        <w:tc>
+          <w:tcPr>
+            <w:tcW w:type="dxa" w:w="5260"/>
+            <w:vAlign w:val="center"/>
+          </w:tcPr>
+          <w:p>
+            <w:pPr>
+              <w:spacing w:before="0" w:after="0" w:line="276" w:lineRule="auto"/>
+              <w:jc w:val="left"/>
+            </w:pPr>
+            <w:r/>
+            <w:r>
+              <w:rPr>
+                <w:rFonts w:ascii="Apple SD Gothic Neo" w:hAnsi="Apple SD Gothic Neo" w:eastAsia="Apple SD Gothic Neo"/>
+                <w:b w:val="0"/>
+                <w:color w:val="17211D"/>
+                <w:sz w:val="18"/>
+              </w:rPr>
+              <w:t>미션 시작/완료/too-hard, 프로그램 참여, 지원 신청/결과, 미니 프로젝트 제출</w:t>
             </w:r>
           </w:p>
         </w:tc>
@@ -875,7 +946,7 @@
                 <w:color w:val="17211D"/>
                 <w:sz w:val="19"/>
               </w:rPr>
-              <w:t>resource_id, mission_id, ranking score, RAG score, stage 번호, reboot point, model metric, raw payload는 사용자 카드에 표시하지 않습니다. 이 정보는 운영자 탭과 API 응답에서만 내부 검증용으로 확인합니다.</w:t>
+              <w:t>resource_id, mission_id, ranking score, RAG score, reboot point, model metric, raw payload는 사용자 카드에 표시하지 않습니다. 이 정보는 검증 탭과 API 응답에서만 내부 검증용으로 확인합니다.</w:t>
             </w:r>
           </w:p>
         </w:tc>
@@ -1664,7 +1735,7 @@
                 <w:color w:val="17211D"/>
                 <w:sz w:val="18"/>
               </w:rPr>
-              <w:t>FastAPI와 Streamlit 사용자/운영자 화면</w:t>
+              <w:t>FastAPI와 Streamlit 오늘 루트/자원·지도/기록/검증 화면</w:t>
             </w:r>
           </w:p>
         </w:tc>
@@ -1713,7 +1784,7 @@
                 <w:color w:val="17211D"/>
                 <w:sz w:val="18"/>
               </w:rPr>
-              <w:t>Feedback Log</w:t>
+              <w:t>Operational Logs</w:t>
             </w:r>
           </w:p>
         </w:tc>
@@ -1757,7 +1828,7 @@
                 <w:color w:val="17211D"/>
                 <w:sz w:val="18"/>
               </w:rPr>
-              <w:t>progress_logs, feedback_events, user_state 저장</w:t>
+              <w:t>progress_logs, feedback_events, outcome_events, user_state 저장</w:t>
             </w:r>
           </w:p>
         </w:tc>
@@ -2087,7 +2158,7 @@
                 <w:color w:val="17211D"/>
                 <w:sz w:val="18"/>
               </w:rPr>
-              <w:t>Pydantic schema: UserProfile, Mission, Resource, ProgressLog, FeedbackEvent, RAGSearchRequest</w:t>
+              <w:t>Pydantic schema: UserProfile, Mission, Resource, ProgressLog, FeedbackEvent, OutcomeEvent, RAGSearchRequest</w:t>
             </w:r>
           </w:p>
         </w:tc>
@@ -2136,7 +2207,7 @@
                 <w:color w:val="17211D"/>
                 <w:sz w:val="18"/>
               </w:rPr>
-              <w:t>SQLite 연결, DB 초기화, progress/feedback 저장, reboot point 조회</w:t>
+              <w:t>SQLite 연결, DB 초기화, progress/feedback/outcome 저장, reboot point 조회</w:t>
             </w:r>
           </w:p>
         </w:tc>
@@ -2234,7 +2305,7 @@
                 <w:color w:val="17211D"/>
                 <w:sz w:val="18"/>
               </w:rPr>
-              <w:t>Streamlit 대시보드. 오늘 순서, 인천 자원 검색, 운영자, 평가 탭</w:t>
+              <w:t>Streamlit 대시보드. 오늘 루트, 자원·지도, 기록, 검증 탭</w:t>
             </w:r>
           </w:p>
         </w:tc>
@@ -3002,6 +3073,77 @@
                 <w:color w:val="17211D"/>
                 <w:sz w:val="18"/>
               </w:rPr>
+              <w:t>data/raw/sample_outcomes.csv</w:t>
+            </w:r>
+          </w:p>
+        </w:tc>
+        <w:tc>
+          <w:tcPr>
+            <w:tcW w:type="dxa" w:w="4210"/>
+            <w:vAlign w:val="center"/>
+          </w:tcPr>
+          <w:p>
+            <w:pPr>
+              <w:spacing w:before="0" w:after="0" w:line="276" w:lineRule="auto"/>
+              <w:jc w:val="left"/>
+            </w:pPr>
+            <w:r/>
+            <w:r>
+              <w:rPr>
+                <w:rFonts w:ascii="Apple SD Gothic Neo" w:hAnsi="Apple SD Gothic Neo" w:eastAsia="Apple SD Gothic Neo"/>
+                <w:b w:val="0"/>
+                <w:color w:val="17211D"/>
+                <w:sz w:val="18"/>
+              </w:rPr>
+              <w:t>outcome import template</w:t>
+            </w:r>
+          </w:p>
+        </w:tc>
+        <w:tc>
+          <w:tcPr>
+            <w:tcW w:type="dxa" w:w="2500"/>
+            <w:vAlign w:val="center"/>
+          </w:tcPr>
+          <w:p>
+            <w:pPr>
+              <w:spacing w:before="0" w:after="0" w:line="276" w:lineRule="auto"/>
+              <w:jc w:val="left"/>
+            </w:pPr>
+            <w:r/>
+            <w:r>
+              <w:rPr>
+                <w:rFonts w:ascii="Apple SD Gothic Neo" w:hAnsi="Apple SD Gothic Neo" w:eastAsia="Apple SD Gothic Neo"/>
+                <w:b w:val="0"/>
+                <w:color w:val="17211D"/>
+                <w:sz w:val="18"/>
+              </w:rPr>
+              <w:t>실제 outcome row는 사용자 또는 기관 관측 후 입력</w:t>
+            </w:r>
+          </w:p>
+        </w:tc>
+      </w:tr>
+      <w:tr>
+        <w:trPr>
+          <w:cantSplit/>
+        </w:trPr>
+        <w:tc>
+          <w:tcPr>
+            <w:tcW w:type="dxa" w:w="2650"/>
+            <w:vAlign w:val="center"/>
+          </w:tcPr>
+          <w:p>
+            <w:pPr>
+              <w:spacing w:before="0" w:after="0" w:line="276" w:lineRule="auto"/>
+              <w:jc w:val="left"/>
+            </w:pPr>
+            <w:r/>
+            <w:r>
+              <w:rPr>
+                <w:rFonts w:ascii="Apple SD Gothic Neo" w:hAnsi="Apple SD Gothic Neo" w:eastAsia="Apple SD Gothic Neo"/>
+                <w:b w:val="0"/>
+                <w:color w:val="17211D"/>
+                <w:sz w:val="18"/>
+              </w:rPr>
               <w:t>data/features/training_features.csv</w:t>
             </w:r>
           </w:p>
@@ -3117,7 +3259,7 @@
                 <w:color w:val="17211D"/>
                 <w:sz w:val="18"/>
               </w:rPr>
-              <w:t>feedback_events, progress_logs, user_state</w:t>
+              <w:t>feedback_events, progress_logs, outcome_events, user_state</w:t>
             </w:r>
           </w:p>
         </w:tc>
@@ -3523,7 +3665,7 @@
           <w:b w:val="0"/>
           <w:color w:val="17211D"/>
         </w:rPr>
-        <w:t>현재 사용자 화면은 실제 사용자 profile을 요구하지 않습니다. 공식 자원 자체의 비용, 부담도, 온라인 확인 가능 여부, 예상 확인 시간을 기준으로 자원을 정렬하고, 가장 부담이 낮은 후보를 기준으로 오늘의 다음 행동을 만듭니다.</w:t>
+        <w:t>현재 사용자 화면은 데모 세션 profile과 공식 자원 속성을 함께 사용합니다. 비용, 부담도, 온라인 확인 가능 여부, 내 위치와의 직선거리, 예상 확인 시간을 기준으로 자원을 정렬하고, 가장 부담이 낮은 후보를 기준으로 오늘의 다음 행동을 만듭니다.</w:t>
       </w:r>
     </w:p>
     <w:p>
@@ -4239,7 +4381,7 @@
           <w:b w:val="0"/>
           <w:color w:val="17211D"/>
         </w:rPr>
-        <w:t>현재 운영 전 데이터 루프 설계는 상태 입력 → safety guardrail → stage 분류 → RAG/mission/resource 추천 → feedback/progress log → human evaluation → batch retraining입니다. 다만 실제 사용자 데이터를 확보할 수 없으므로, 사용자-facing 데모에서는 개인정보성 상태 입력을 제외하고 공식 자원 확인 흐름을 우선합니다.</w:t>
+        <w:t>현재 운영 전 데이터 루프 설계는 상태 입력 → safety guardrail → stage 분류 → RAG/mission/resource 추천 → progress/feedback/outcome log → human evaluation → batch retraining입니다. 실제 사용자 데이터가 없어 학습 label은 synthetic placeholder이지만, 데모 중 미션 시작/완료/too-hard와 프로그램 참여, 지원 신청, 지원 결과, 미니 프로젝트 제출, 운영자 검토는 SQLite에 기록됩니다.</w:t>
       </w:r>
     </w:p>
     <w:tbl>
@@ -4494,6 +4636,77 @@
                 <w:color w:val="17211D"/>
                 <w:sz w:val="18"/>
               </w:rPr>
+              <w:t>outcome_events</w:t>
+            </w:r>
+          </w:p>
+        </w:tc>
+        <w:tc>
+          <w:tcPr>
+            <w:tcW w:type="dxa" w:w="4700"/>
+            <w:vAlign w:val="center"/>
+          </w:tcPr>
+          <w:p>
+            <w:pPr>
+              <w:spacing w:before="0" w:after="0" w:line="276" w:lineRule="auto"/>
+              <w:jc w:val="left"/>
+            </w:pPr>
+            <w:r/>
+            <w:r>
+              <w:rPr>
+                <w:rFonts w:ascii="Apple SD Gothic Neo" w:hAnsi="Apple SD Gothic Neo" w:eastAsia="Apple SD Gothic Neo"/>
+                <w:b w:val="0"/>
+                <w:color w:val="17211D"/>
+                <w:sz w:val="18"/>
+              </w:rPr>
+              <w:t>outcome_id, user_id, outcome_type, outcome_status, mission_id, resource_id, readiness_rating, burden_after, result_note</w:t>
+            </w:r>
+          </w:p>
+        </w:tc>
+        <w:tc>
+          <w:tcPr>
+            <w:tcW w:type="dxa" w:w="2960"/>
+            <w:vAlign w:val="center"/>
+          </w:tcPr>
+          <w:p>
+            <w:pPr>
+              <w:spacing w:before="0" w:after="0" w:line="276" w:lineRule="auto"/>
+              <w:jc w:val="left"/>
+            </w:pPr>
+            <w:r/>
+            <w:r>
+              <w:rPr>
+                <w:rFonts w:ascii="Apple SD Gothic Neo" w:hAnsi="Apple SD Gothic Neo" w:eastAsia="Apple SD Gothic Neo"/>
+                <w:b w:val="0"/>
+                <w:color w:val="17211D"/>
+                <w:sz w:val="18"/>
+              </w:rPr>
+              <w:t>프로그램 참여, 지원 신청/결과, 미니 프로젝트 제출, 운영자 검토 outcome 저장</w:t>
+            </w:r>
+          </w:p>
+        </w:tc>
+      </w:tr>
+      <w:tr>
+        <w:trPr>
+          <w:cantSplit/>
+        </w:trPr>
+        <w:tc>
+          <w:tcPr>
+            <w:tcW w:type="dxa" w:w="1700"/>
+            <w:vAlign w:val="center"/>
+          </w:tcPr>
+          <w:p>
+            <w:pPr>
+              <w:spacing w:before="0" w:after="0" w:line="276" w:lineRule="auto"/>
+              <w:jc w:val="left"/>
+            </w:pPr>
+            <w:r/>
+            <w:r>
+              <w:rPr>
+                <w:rFonts w:ascii="Apple SD Gothic Neo" w:hAnsi="Apple SD Gothic Neo" w:eastAsia="Apple SD Gothic Neo"/>
+                <w:b w:val="0"/>
+                <w:color w:val="17211D"/>
+                <w:sz w:val="18"/>
+              </w:rPr>
               <w:t>user_state</w:t>
             </w:r>
           </w:p>
@@ -4679,7 +4892,7 @@
                 <w:color w:val="17211D"/>
                 <w:sz w:val="18"/>
               </w:rPr>
-              <w:t>오늘 순서</w:t>
+              <w:t>오늘 루트</w:t>
             </w:r>
           </w:p>
         </w:tc>
@@ -4723,7 +4936,7 @@
                 <w:color w:val="17211D"/>
                 <w:sz w:val="18"/>
               </w:rPr>
-              <w:t>공식 자원 확인 → 조건 줄이기 → 오늘의 최소 행동 제안. ID, score, stage, point 숨김</w:t>
+              <w:t>내 조건 입력 → 추천 루트 → 지도 → 미션/결과 기록. ID, score, point 숨김</w:t>
             </w:r>
           </w:p>
         </w:tc>
@@ -4750,7 +4963,7 @@
                 <w:color w:val="17211D"/>
                 <w:sz w:val="18"/>
               </w:rPr>
-              <w:t>인천 자원 검색</w:t>
+              <w:t>자원·지도</w:t>
             </w:r>
           </w:p>
         </w:tc>
@@ -4794,7 +5007,7 @@
                 <w:color w:val="17211D"/>
                 <w:sz w:val="18"/>
               </w:rPr>
-              <w:t>RAG 검색 결과를 자원 카드와 공식 출처 링크 중심으로 표시. resource id, rag score 숨김</w:t>
+              <w:t>RAG 검색 결과를 자원 카드, 공식 출처 링크, 내 위치/활동 장소 지도 중심으로 표시</w:t>
             </w:r>
           </w:p>
         </w:tc>
@@ -4821,7 +5034,78 @@
                 <w:color w:val="17211D"/>
                 <w:sz w:val="18"/>
               </w:rPr>
-              <w:t>운영자</w:t>
+              <w:t>기록</w:t>
+            </w:r>
+          </w:p>
+        </w:tc>
+        <w:tc>
+          <w:tcPr>
+            <w:tcW w:type="dxa" w:w="1900"/>
+            <w:vAlign w:val="center"/>
+          </w:tcPr>
+          <w:p>
+            <w:pPr>
+              <w:spacing w:before="0" w:after="0" w:line="276" w:lineRule="auto"/>
+              <w:jc w:val="left"/>
+            </w:pPr>
+            <w:r/>
+            <w:r>
+              <w:rPr>
+                <w:rFonts w:ascii="Apple SD Gothic Neo" w:hAnsi="Apple SD Gothic Neo" w:eastAsia="Apple SD Gothic Neo"/>
+                <w:b w:val="0"/>
+                <w:color w:val="17211D"/>
+                <w:sz w:val="18"/>
+              </w:rPr>
+              <w:t>실제 사용자/발표자</w:t>
+            </w:r>
+          </w:p>
+        </w:tc>
+        <w:tc>
+          <w:tcPr>
+            <w:tcW w:type="dxa" w:w="5760"/>
+            <w:vAlign w:val="center"/>
+          </w:tcPr>
+          <w:p>
+            <w:pPr>
+              <w:spacing w:before="0" w:after="0" w:line="276" w:lineRule="auto"/>
+              <w:jc w:val="left"/>
+            </w:pPr>
+            <w:r/>
+            <w:r>
+              <w:rPr>
+                <w:rFonts w:ascii="Apple SD Gothic Neo" w:hAnsi="Apple SD Gothic Neo" w:eastAsia="Apple SD Gothic Neo"/>
+                <w:b w:val="0"/>
+                <w:color w:val="17211D"/>
+                <w:sz w:val="18"/>
+              </w:rPr>
+              <w:t>데모 세션의 progress/outcome/feedback 개수와 최근 로그 확인</w:t>
+            </w:r>
+          </w:p>
+        </w:tc>
+      </w:tr>
+      <w:tr>
+        <w:trPr>
+          <w:cantSplit/>
+        </w:trPr>
+        <w:tc>
+          <w:tcPr>
+            <w:tcW w:type="dxa" w:w="1700"/>
+            <w:vAlign w:val="center"/>
+          </w:tcPr>
+          <w:p>
+            <w:pPr>
+              <w:spacing w:before="0" w:after="0" w:line="276" w:lineRule="auto"/>
+              <w:jc w:val="left"/>
+            </w:pPr>
+            <w:r/>
+            <w:r>
+              <w:rPr>
+                <w:rFonts w:ascii="Apple SD Gothic Neo" w:hAnsi="Apple SD Gothic Neo" w:eastAsia="Apple SD Gothic Neo"/>
+                <w:b w:val="0"/>
+                <w:color w:val="17211D"/>
+                <w:sz w:val="18"/>
+              </w:rPr>
+              <w:t>검증</w:t>
             </w:r>
           </w:p>
         </w:tc>
@@ -4865,78 +5149,7 @@
                 <w:color w:val="17211D"/>
                 <w:sz w:val="18"/>
               </w:rPr>
-              <w:t>Rule stage, ML 보조 stage, contributing factors, IDs, score, raw payload, feedback/progress log 확인</w:t>
-            </w:r>
-          </w:p>
-        </w:tc>
-      </w:tr>
-      <w:tr>
-        <w:trPr>
-          <w:cantSplit/>
-        </w:trPr>
-        <w:tc>
-          <w:tcPr>
-            <w:tcW w:type="dxa" w:w="1700"/>
-            <w:vAlign w:val="center"/>
-          </w:tcPr>
-          <w:p>
-            <w:pPr>
-              <w:spacing w:before="0" w:after="0" w:line="276" w:lineRule="auto"/>
-              <w:jc w:val="left"/>
-            </w:pPr>
-            <w:r/>
-            <w:r>
-              <w:rPr>
-                <w:rFonts w:ascii="Apple SD Gothic Neo" w:hAnsi="Apple SD Gothic Neo" w:eastAsia="Apple SD Gothic Neo"/>
-                <w:b w:val="0"/>
-                <w:color w:val="17211D"/>
-                <w:sz w:val="18"/>
-              </w:rPr>
-              <w:t>평가</w:t>
-            </w:r>
-          </w:p>
-        </w:tc>
-        <w:tc>
-          <w:tcPr>
-            <w:tcW w:type="dxa" w:w="1900"/>
-            <w:vAlign w:val="center"/>
-          </w:tcPr>
-          <w:p>
-            <w:pPr>
-              <w:spacing w:before="0" w:after="0" w:line="276" w:lineRule="auto"/>
-              <w:jc w:val="left"/>
-            </w:pPr>
-            <w:r/>
-            <w:r>
-              <w:rPr>
-                <w:rFonts w:ascii="Apple SD Gothic Neo" w:hAnsi="Apple SD Gothic Neo" w:eastAsia="Apple SD Gothic Neo"/>
-                <w:b w:val="0"/>
-                <w:color w:val="17211D"/>
-                <w:sz w:val="18"/>
-              </w:rPr>
-              <w:t>발표자/운영자</w:t>
-            </w:r>
-          </w:p>
-        </w:tc>
-        <w:tc>
-          <w:tcPr>
-            <w:tcW w:type="dxa" w:w="5760"/>
-            <w:vAlign w:val="center"/>
-          </w:tcPr>
-          <w:p>
-            <w:pPr>
-              <w:spacing w:before="0" w:after="0" w:line="276" w:lineRule="auto"/>
-              <w:jc w:val="left"/>
-            </w:pPr>
-            <w:r/>
-            <w:r>
-              <w:rPr>
-                <w:rFonts w:ascii="Apple SD Gothic Neo" w:hAnsi="Apple SD Gothic Neo" w:eastAsia="Apple SD Gothic Neo"/>
-                <w:b w:val="0"/>
-                <w:color w:val="17211D"/>
-                <w:sz w:val="18"/>
-              </w:rPr>
-              <w:t>모델 metric, data version, model/data card, human eval sheet, synthetic label warning 확인</w:t>
+              <w:t>Rule stage, ML 보조 stage, contributing factors, IDs, score, raw payload, feedback/progress/outcome log, 운영자 review 입력, 모델 metric 확인</w:t>
             </w:r>
           </w:p>
         </w:tc>
@@ -4958,7 +5171,7 @@
           <w:rFonts w:ascii="Apple SD Gothic Neo" w:hAnsi="Apple SD Gothic Neo" w:eastAsia="Apple SD Gothic Neo"/>
           <w:color w:val="17211D"/>
         </w:rPr>
-        <w:t>첫 화면에서 나이, 부담도, 자유입력 등 개인정보성 demo profile 입력을 제거했습니다.</w:t>
+        <w:t>첫 화면은 내 조건, 추천 루트, 지도, 결과 기록 순서로 보이도록 재구성했습니다.</w:t>
       </w:r>
     </w:p>
     <w:p>
@@ -4972,7 +5185,7 @@
           <w:rFonts w:ascii="Apple SD Gothic Neo" w:hAnsi="Apple SD Gothic Neo" w:eastAsia="Apple SD Gothic Neo"/>
           <w:color w:val="17211D"/>
         </w:rPr>
-        <w:t>필터 변경 즉시 결과와 다음 행동이 갱신됩니다.</w:t>
+        <w:t>조건 변경 즉시 추천 루트, 미션, 자원 후보, 지도 위치가 갱신됩니다.</w:t>
       </w:r>
     </w:p>
     <w:p>
@@ -4986,7 +5199,7 @@
           <w:rFonts w:ascii="Apple SD Gothic Neo" w:hAnsi="Apple SD Gothic Neo" w:eastAsia="Apple SD Gothic Neo"/>
           <w:color w:val="17211D"/>
         </w:rPr>
-        <w:t>저장/북마크/정보접촉 같은 의미 낮은 행동은 사용자 화면에서 제거했습니다.</w:t>
+        <w:t>사용자 화면의 행동은 시작, 완료, 너무 어려움, 참여/지원 결과처럼 실제 학습 loop에 필요한 기록으로 정리했습니다.</w:t>
       </w:r>
     </w:p>
     <w:p>
@@ -5000,7 +5213,35 @@
           <w:rFonts w:ascii="Apple SD Gothic Neo" w:hAnsi="Apple SD Gothic Neo" w:eastAsia="Apple SD Gothic Neo"/>
           <w:color w:val="17211D"/>
         </w:rPr>
-        <w:t>사용자 화면에는 내부 ranking score, 식별자, Stage 번호, point를 숨기고, 운영자 탭에서만 표로 공개합니다.</w:t>
+        <w:t>사용자 화면에는 내부 ranking score, 식별자, point를 숨기고, 검증 탭에서만 표로 공개합니다.</w:t>
+      </w:r>
+    </w:p>
+    <w:p>
+      <w:pPr>
+        <w:pStyle w:val="ListBullet"/>
+        <w:spacing w:before="0" w:after="80" w:line="300" w:lineRule="auto"/>
+        <w:ind w:left="547" w:hanging="274"/>
+      </w:pPr>
+      <w:r>
+        <w:rPr>
+          <w:rFonts w:ascii="Apple SD Gothic Neo" w:hAnsi="Apple SD Gothic Neo" w:eastAsia="Apple SD Gothic Neo"/>
+          <w:color w:val="17211D"/>
+        </w:rPr>
+        <w:t>위도/경도 기반 미니맵으로 내 위치와 활동 장소를 함께 표시합니다.</w:t>
+      </w:r>
+    </w:p>
+    <w:p>
+      <w:pPr>
+        <w:pStyle w:val="ListBullet"/>
+        <w:spacing w:before="0" w:after="80" w:line="300" w:lineRule="auto"/>
+        <w:ind w:left="547" w:hanging="274"/>
+      </w:pPr>
+      <w:r>
+        <w:rPr>
+          <w:rFonts w:ascii="Apple SD Gothic Neo" w:hAnsi="Apple SD Gothic Neo" w:eastAsia="Apple SD Gothic Neo"/>
+          <w:color w:val="17211D"/>
+        </w:rPr>
+        <w:t>미션 시작/완료/too-hard, 프로그램 참여, 지원 신청/결과, 미니 프로젝트 제출, 운영자 review를 SQLite에 저장합니다.</w:t>
       </w:r>
     </w:p>
     <w:p>
@@ -5831,6 +6072,148 @@
                 <w:sz w:val="18"/>
               </w:rPr>
               <w:t>progress log 저장 및 point 갱신</w:t>
+            </w:r>
+          </w:p>
+        </w:tc>
+      </w:tr>
+      <w:tr>
+        <w:trPr>
+          <w:cantSplit/>
+        </w:trPr>
+        <w:tc>
+          <w:tcPr>
+            <w:tcW w:type="dxa" w:w="2500"/>
+            <w:vAlign w:val="center"/>
+          </w:tcPr>
+          <w:p>
+            <w:pPr>
+              <w:spacing w:before="0" w:after="0" w:line="276" w:lineRule="auto"/>
+              <w:jc w:val="left"/>
+            </w:pPr>
+            <w:r/>
+            <w:r>
+              <w:rPr>
+                <w:rFonts w:ascii="Apple SD Gothic Neo" w:hAnsi="Apple SD Gothic Neo" w:eastAsia="Apple SD Gothic Neo"/>
+                <w:b w:val="0"/>
+                <w:color w:val="17211D"/>
+                <w:sz w:val="18"/>
+              </w:rPr>
+              <w:t>/outcomes/log</w:t>
+            </w:r>
+          </w:p>
+        </w:tc>
+        <w:tc>
+          <w:tcPr>
+            <w:tcW w:type="dxa" w:w="1100"/>
+            <w:vAlign w:val="center"/>
+          </w:tcPr>
+          <w:p>
+            <w:pPr>
+              <w:spacing w:before="0" w:after="0" w:line="276" w:lineRule="auto"/>
+              <w:jc w:val="left"/>
+            </w:pPr>
+            <w:r/>
+            <w:r>
+              <w:rPr>
+                <w:rFonts w:ascii="Apple SD Gothic Neo" w:hAnsi="Apple SD Gothic Neo" w:eastAsia="Apple SD Gothic Neo"/>
+                <w:b w:val="0"/>
+                <w:color w:val="17211D"/>
+                <w:sz w:val="18"/>
+              </w:rPr>
+              <w:t>POST</w:t>
+            </w:r>
+          </w:p>
+        </w:tc>
+        <w:tc>
+          <w:tcPr>
+            <w:tcW w:type="dxa" w:w="5760"/>
+            <w:vAlign w:val="center"/>
+          </w:tcPr>
+          <w:p>
+            <w:pPr>
+              <w:spacing w:before="0" w:after="0" w:line="276" w:lineRule="auto"/>
+              <w:jc w:val="left"/>
+            </w:pPr>
+            <w:r/>
+            <w:r>
+              <w:rPr>
+                <w:rFonts w:ascii="Apple SD Gothic Neo" w:hAnsi="Apple SD Gothic Neo" w:eastAsia="Apple SD Gothic Neo"/>
+                <w:b w:val="0"/>
+                <w:color w:val="17211D"/>
+                <w:sz w:val="18"/>
+              </w:rPr>
+              <w:t>program participation, support application/result, mini project submission, operator review outcome 저장</w:t>
+            </w:r>
+          </w:p>
+        </w:tc>
+      </w:tr>
+      <w:tr>
+        <w:trPr>
+          <w:cantSplit/>
+        </w:trPr>
+        <w:tc>
+          <w:tcPr>
+            <w:tcW w:type="dxa" w:w="2500"/>
+            <w:vAlign w:val="center"/>
+          </w:tcPr>
+          <w:p>
+            <w:pPr>
+              <w:spacing w:before="0" w:after="0" w:line="276" w:lineRule="auto"/>
+              <w:jc w:val="left"/>
+            </w:pPr>
+            <w:r/>
+            <w:r>
+              <w:rPr>
+                <w:rFonts w:ascii="Apple SD Gothic Neo" w:hAnsi="Apple SD Gothic Neo" w:eastAsia="Apple SD Gothic Neo"/>
+                <w:b w:val="0"/>
+                <w:color w:val="17211D"/>
+                <w:sz w:val="18"/>
+              </w:rPr>
+              <w:t>/outcomes</w:t>
+            </w:r>
+          </w:p>
+        </w:tc>
+        <w:tc>
+          <w:tcPr>
+            <w:tcW w:type="dxa" w:w="1100"/>
+            <w:vAlign w:val="center"/>
+          </w:tcPr>
+          <w:p>
+            <w:pPr>
+              <w:spacing w:before="0" w:after="0" w:line="276" w:lineRule="auto"/>
+              <w:jc w:val="left"/>
+            </w:pPr>
+            <w:r/>
+            <w:r>
+              <w:rPr>
+                <w:rFonts w:ascii="Apple SD Gothic Neo" w:hAnsi="Apple SD Gothic Neo" w:eastAsia="Apple SD Gothic Neo"/>
+                <w:b w:val="0"/>
+                <w:color w:val="17211D"/>
+                <w:sz w:val="18"/>
+              </w:rPr>
+              <w:t>GET</w:t>
+            </w:r>
+          </w:p>
+        </w:tc>
+        <w:tc>
+          <w:tcPr>
+            <w:tcW w:type="dxa" w:w="5760"/>
+            <w:vAlign w:val="center"/>
+          </w:tcPr>
+          <w:p>
+            <w:pPr>
+              <w:spacing w:before="0" w:after="0" w:line="276" w:lineRule="auto"/>
+              <w:jc w:val="left"/>
+            </w:pPr>
+            <w:r/>
+            <w:r>
+              <w:rPr>
+                <w:rFonts w:ascii="Apple SD Gothic Neo" w:hAnsi="Apple SD Gothic Neo" w:eastAsia="Apple SD Gothic Neo"/>
+                <w:b w:val="0"/>
+                <w:color w:val="17211D"/>
+                <w:sz w:val="18"/>
+              </w:rPr>
+              <w:t>사용자별 outcome log 조회</w:t>
             </w:r>
           </w:p>
         </w:tc>
@@ -6909,7 +7292,7 @@
           <w:rFonts w:ascii="Apple SD Gothic Neo" w:hAnsi="Apple SD Gothic Neo" w:eastAsia="Apple SD Gothic Neo"/>
           <w:color w:val="17211D"/>
         </w:rPr>
-        <w:t>오늘 순서 탭에서 공식 자원 카드와 세 단계 흐름을 보여준다.</w:t>
+        <w:t>오늘 루트 탭에서 내 조건 → 추천 루트 → 지도 → 결과 기록 순서가 보이는지 확인한다.</w:t>
       </w:r>
     </w:p>
     <w:p>
@@ -6923,7 +7306,7 @@
           <w:rFonts w:ascii="Apple SD Gothic Neo" w:hAnsi="Apple SD Gothic Neo" w:eastAsia="Apple SD Gothic Neo"/>
           <w:color w:val="17211D"/>
         </w:rPr>
-        <w:t>자원 종류, 구/군, 비용, 최대 부담도, 온라인 확인 가능 여부를 바꿔 결과가 즉시 바뀌는 것을 보여준다.</w:t>
+        <w:t>외출 부담, 대면 부담, 위치, 자원 종류, 비용, 최대 부담도를 바꿔 추천 미션과 자원 후보가 즉시 바뀌는 것을 보여준다.</w:t>
       </w:r>
     </w:p>
     <w:p>
@@ -6937,7 +7320,7 @@
           <w:rFonts w:ascii="Apple SD Gothic Neo" w:hAnsi="Apple SD Gothic Neo" w:eastAsia="Apple SD Gothic Neo"/>
           <w:color w:val="17211D"/>
         </w:rPr>
-        <w:t>오늘의 가장 작은 행동이 신청/방문 강요가 아니라 공식 페이지 확인과 조건 1줄 정리임을 설명한다.</w:t>
+        <w:t>지도에서 내 위치와 활동 장소가 함께 표시되는 것을 보여준다.</w:t>
       </w:r>
     </w:p>
     <w:p>
@@ -6951,7 +7334,7 @@
           <w:rFonts w:ascii="Apple SD Gothic Neo" w:hAnsi="Apple SD Gothic Neo" w:eastAsia="Apple SD Gothic Neo"/>
           <w:color w:val="17211D"/>
         </w:rPr>
-        <w:t>인천 자원 검색 탭에서 RAG 검색 결과와 공식 출처 링크가 표시되는 것을 보여준다.</w:t>
+        <w:t>미션 시작/완료/너무 어려움 버튼을 눌러 progress log가 저장되는 것을 보여준다.</w:t>
       </w:r>
     </w:p>
     <w:p>
@@ -6965,7 +7348,7 @@
           <w:rFonts w:ascii="Apple SD Gothic Neo" w:hAnsi="Apple SD Gothic Neo" w:eastAsia="Apple SD Gothic Neo"/>
           <w:color w:val="17211D"/>
         </w:rPr>
-        <w:t>운영자 탭에서 mission_id, resource_id, score, raw payload, feedback log가 내부 검증용으로만 보이는 것을 확인한다.</w:t>
+        <w:t>활동/지원 결과 기록 폼에서 프로그램 참여 또는 지원 신청 outcome을 저장한다.</w:t>
       </w:r>
     </w:p>
     <w:p>
@@ -6979,7 +7362,7 @@
           <w:rFonts w:ascii="Apple SD Gothic Neo" w:hAnsi="Apple SD Gothic Neo" w:eastAsia="Apple SD Gothic Neo"/>
           <w:color w:val="17211D"/>
         </w:rPr>
-        <w:t>평가 탭에서 data version, 모델 metric, human eval sheet, synthetic label warning을 설명한다.</w:t>
+        <w:t>자원·지도 탭에서 RAG 검색 결과, 공식 출처 링크, 지도 표시를 보여준다.</w:t>
       </w:r>
     </w:p>
     <w:p>
@@ -6993,7 +7376,35 @@
           <w:rFonts w:ascii="Apple SD Gothic Neo" w:hAnsi="Apple SD Gothic Neo" w:eastAsia="Apple SD Gothic Neo"/>
           <w:color w:val="17211D"/>
         </w:rPr>
-        <w:t>API 문서에서 safety guardrail과 feedback endpoint가 남아 있음을 보여주되, 사용자 화면은 개인정보성 입력을 요구하지 않는다고 설명한다.</w:t>
+        <w:t>기록 탭에서 progress/outcome/feedback 로그가 쌓인 것을 확인한다.</w:t>
+      </w:r>
+    </w:p>
+    <w:p>
+      <w:pPr>
+        <w:pStyle w:val="ListNumber"/>
+        <w:spacing w:before="0" w:after="80" w:line="300" w:lineRule="auto"/>
+        <w:ind w:left="547" w:hanging="274"/>
+      </w:pPr>
+      <w:r>
+        <w:rPr>
+          <w:rFonts w:ascii="Apple SD Gothic Neo" w:hAnsi="Apple SD Gothic Neo" w:eastAsia="Apple SD Gothic Neo"/>
+          <w:color w:val="17211D"/>
+        </w:rPr>
+        <w:t>검증 탭에서 mission_id, resource_id, score, raw payload, feedback/outcome log가 내부 검증용으로만 보이는 것을 확인한다.</w:t>
+      </w:r>
+    </w:p>
+    <w:p>
+      <w:pPr>
+        <w:pStyle w:val="ListNumber"/>
+        <w:spacing w:before="0" w:after="80" w:line="300" w:lineRule="auto"/>
+        <w:ind w:left="547" w:hanging="274"/>
+      </w:pPr>
+      <w:r>
+        <w:rPr>
+          <w:rFonts w:ascii="Apple SD Gothic Neo" w:hAnsi="Apple SD Gothic Neo" w:eastAsia="Apple SD Gothic Neo"/>
+          <w:color w:val="17211D"/>
+        </w:rPr>
+        <w:t>API 문서에서 safety guardrail, feedback, progress, outcomes endpoint가 구현되어 있음을 보여준다.</w:t>
       </w:r>
     </w:p>
     <w:p>
@@ -7214,7 +7625,7 @@
                 <w:color w:val="17211D"/>
                 <w:sz w:val="18"/>
               </w:rPr>
-              <w:t>schema/API/pipeline 구현</w:t>
+              <w:t>schema/API/dashboard 기록 구현</w:t>
             </w:r>
           </w:p>
         </w:tc>
@@ -7427,7 +7838,7 @@
                 <w:color w:val="17211D"/>
                 <w:sz w:val="18"/>
               </w:rPr>
-              <w:t>debug view 중심</w:t>
+              <w:t>검증 view와 review 입력 구현</w:t>
             </w:r>
           </w:p>
         </w:tc>
@@ -7656,7 +8067,7 @@
           <w:rFonts w:ascii="Apple SD Gothic Neo" w:hAnsi="Apple SD Gothic Neo" w:eastAsia="Apple SD Gothic Neo"/>
           <w:color w:val="17211D"/>
         </w:rPr>
-        <w:t>거리 계산은 실제 이동거리가 아니라 구/군 일치 proxy에 가깝습니다.</w:t>
+        <w:t>지도 거리는 위도/경도 기반 직선거리 근사이며 실제 대중교통 이동시간은 아닙니다.</w:t>
       </w:r>
     </w:p>
     <w:p>
@@ -7838,7 +8249,7 @@
                 <w:color w:val="17211D"/>
                 <w:sz w:val="18"/>
               </w:rPr>
-              <w:t>9 passed</w:t>
+              <w:t>11 passed</w:t>
             </w:r>
           </w:p>
         </w:tc>
@@ -7985,7 +8396,7 @@
                 <w:color w:val="17211D"/>
                 <w:sz w:val="18"/>
               </w:rPr>
-              <w:t>사용자 화면의 개인 상태 입력 제거, 공식 자원 중심 흐름, ID/score 숨김, 모바일/색상 대비 점검</w:t>
+              <w:t>내 조건→추천 루트→지도→결과 기록 흐름, ID/score 숨김, 모바일/색상 대비 점검</w:t>
             </w:r>
           </w:p>
         </w:tc>

</xml_diff>

<commit_message>
Add capstone requirement artifacts
</commit_message>
<xml_diff>
--- a/docs/RebootRoute_Project_Report.docx
+++ b/docs/RebootRoute_Project_Report.docx
@@ -3570,6 +3570,148 @@
                 <w:color w:val="17211D"/>
                 <w:sz w:val="18"/>
               </w:rPr>
+              <w:t>reports/error_analysis.md</w:t>
+            </w:r>
+          </w:p>
+        </w:tc>
+        <w:tc>
+          <w:tcPr>
+            <w:tcW w:type="dxa" w:w="4210"/>
+            <w:vAlign w:val="center"/>
+          </w:tcPr>
+          <w:p>
+            <w:pPr>
+              <w:spacing w:before="0" w:after="0" w:line="276" w:lineRule="auto"/>
+              <w:jc w:val="left"/>
+            </w:pPr>
+            <w:r/>
+            <w:r>
+              <w:rPr>
+                <w:rFonts w:ascii="Apple SD Gothic Neo" w:hAnsi="Apple SD Gothic Neo" w:eastAsia="Apple SD Gothic Neo"/>
+                <w:b w:val="0"/>
+                <w:color w:val="17211D"/>
+                <w:sz w:val="18"/>
+              </w:rPr>
+              <w:t>baseline 비교, confusion matrix, reliability, 취약 구간</w:t>
+            </w:r>
+          </w:p>
+        </w:tc>
+        <w:tc>
+          <w:tcPr>
+            <w:tcW w:type="dxa" w:w="2500"/>
+            <w:vAlign w:val="center"/>
+          </w:tcPr>
+          <w:p>
+            <w:pPr>
+              <w:spacing w:before="0" w:after="0" w:line="276" w:lineRule="auto"/>
+              <w:jc w:val="left"/>
+            </w:pPr>
+            <w:r/>
+            <w:r>
+              <w:rPr>
+                <w:rFonts w:ascii="Apple SD Gothic Neo" w:hAnsi="Apple SD Gothic Neo" w:eastAsia="Apple SD Gothic Neo"/>
+                <w:b w:val="0"/>
+                <w:color w:val="17211D"/>
+                <w:sz w:val="18"/>
+              </w:rPr>
+              <w:t>PDF 오류분석/XAI 산출물</w:t>
+            </w:r>
+          </w:p>
+        </w:tc>
+      </w:tr>
+      <w:tr>
+        <w:trPr>
+          <w:cantSplit/>
+        </w:trPr>
+        <w:tc>
+          <w:tcPr>
+            <w:tcW w:type="dxa" w:w="2650"/>
+            <w:vAlign w:val="center"/>
+          </w:tcPr>
+          <w:p>
+            <w:pPr>
+              <w:spacing w:before="0" w:after="0" w:line="276" w:lineRule="auto"/>
+              <w:jc w:val="left"/>
+            </w:pPr>
+            <w:r/>
+            <w:r>
+              <w:rPr>
+                <w:rFonts w:ascii="Apple SD Gothic Neo" w:hAnsi="Apple SD Gothic Neo" w:eastAsia="Apple SD Gothic Neo"/>
+                <w:b w:val="0"/>
+                <w:color w:val="17211D"/>
+                <w:sz w:val="18"/>
+              </w:rPr>
+              <w:t>reports/capstone_requirements_check.md</w:t>
+            </w:r>
+          </w:p>
+        </w:tc>
+        <w:tc>
+          <w:tcPr>
+            <w:tcW w:type="dxa" w:w="4210"/>
+            <w:vAlign w:val="center"/>
+          </w:tcPr>
+          <w:p>
+            <w:pPr>
+              <w:spacing w:before="0" w:after="0" w:line="276" w:lineRule="auto"/>
+              <w:jc w:val="left"/>
+            </w:pPr>
+            <w:r/>
+            <w:r>
+              <w:rPr>
+                <w:rFonts w:ascii="Apple SD Gothic Neo" w:hAnsi="Apple SD Gothic Neo" w:eastAsia="Apple SD Gothic Neo"/>
+                <w:b w:val="0"/>
+                <w:color w:val="17211D"/>
+                <w:sz w:val="18"/>
+              </w:rPr>
+              <w:t>week15 capstone workshop PDF 요구사항 대응표</w:t>
+            </w:r>
+          </w:p>
+        </w:tc>
+        <w:tc>
+          <w:tcPr>
+            <w:tcW w:type="dxa" w:w="2500"/>
+            <w:vAlign w:val="center"/>
+          </w:tcPr>
+          <w:p>
+            <w:pPr>
+              <w:spacing w:before="0" w:after="0" w:line="276" w:lineRule="auto"/>
+              <w:jc w:val="left"/>
+            </w:pPr>
+            <w:r/>
+            <w:r>
+              <w:rPr>
+                <w:rFonts w:ascii="Apple SD Gothic Neo" w:hAnsi="Apple SD Gothic Neo" w:eastAsia="Apple SD Gothic Neo"/>
+                <w:b w:val="0"/>
+                <w:color w:val="17211D"/>
+                <w:sz w:val="18"/>
+              </w:rPr>
+              <w:t>발표 전 점검 산출물</w:t>
+            </w:r>
+          </w:p>
+        </w:tc>
+      </w:tr>
+      <w:tr>
+        <w:trPr>
+          <w:cantSplit/>
+        </w:trPr>
+        <w:tc>
+          <w:tcPr>
+            <w:tcW w:type="dxa" w:w="2650"/>
+            <w:vAlign w:val="center"/>
+          </w:tcPr>
+          <w:p>
+            <w:pPr>
+              <w:spacing w:before="0" w:after="0" w:line="276" w:lineRule="auto"/>
+              <w:jc w:val="left"/>
+            </w:pPr>
+            <w:r/>
+            <w:r>
+              <w:rPr>
+                <w:rFonts w:ascii="Apple SD Gothic Neo" w:hAnsi="Apple SD Gothic Neo" w:eastAsia="Apple SD Gothic Neo"/>
+                <w:b w:val="0"/>
+                <w:color w:val="17211D"/>
+                <w:sz w:val="18"/>
+              </w:rPr>
               <w:t>reports/human_eval_review_sheet.csv</w:t>
             </w:r>
           </w:p>
@@ -3615,6 +3757,290 @@
                 <w:sz w:val="18"/>
               </w:rPr>
               <w:t>사람이 빈 score column을 채점</w:t>
+            </w:r>
+          </w:p>
+        </w:tc>
+      </w:tr>
+      <w:tr>
+        <w:trPr>
+          <w:cantSplit/>
+        </w:trPr>
+        <w:tc>
+          <w:tcPr>
+            <w:tcW w:type="dxa" w:w="2650"/>
+            <w:vAlign w:val="center"/>
+          </w:tcPr>
+          <w:p>
+            <w:pPr>
+              <w:spacing w:before="0" w:after="0" w:line="276" w:lineRule="auto"/>
+              <w:jc w:val="left"/>
+            </w:pPr>
+            <w:r/>
+            <w:r>
+              <w:rPr>
+                <w:rFonts w:ascii="Apple SD Gothic Neo" w:hAnsi="Apple SD Gothic Neo" w:eastAsia="Apple SD Gothic Neo"/>
+                <w:b w:val="0"/>
+                <w:color w:val="17211D"/>
+                <w:sz w:val="18"/>
+              </w:rPr>
+              <w:t>docs/capstone_project_brief.md</w:t>
+            </w:r>
+          </w:p>
+        </w:tc>
+        <w:tc>
+          <w:tcPr>
+            <w:tcW w:type="dxa" w:w="4210"/>
+            <w:vAlign w:val="center"/>
+          </w:tcPr>
+          <w:p>
+            <w:pPr>
+              <w:spacing w:before="0" w:after="0" w:line="276" w:lineRule="auto"/>
+              <w:jc w:val="left"/>
+            </w:pPr>
+            <w:r/>
+            <w:r>
+              <w:rPr>
+                <w:rFonts w:ascii="Apple SD Gothic Neo" w:hAnsi="Apple SD Gothic Neo" w:eastAsia="Apple SD Gothic Neo"/>
+                <w:b w:val="0"/>
+                <w:color w:val="17211D"/>
+                <w:sz w:val="18"/>
+              </w:rPr>
+              <w:t>문제 정의, 사용자 시나리오, 성공 기준, 팀 역할</w:t>
+            </w:r>
+          </w:p>
+        </w:tc>
+        <w:tc>
+          <w:tcPr>
+            <w:tcW w:type="dxa" w:w="2500"/>
+            <w:vAlign w:val="center"/>
+          </w:tcPr>
+          <w:p>
+            <w:pPr>
+              <w:spacing w:before="0" w:after="0" w:line="276" w:lineRule="auto"/>
+              <w:jc w:val="left"/>
+            </w:pPr>
+            <w:r/>
+            <w:r>
+              <w:rPr>
+                <w:rFonts w:ascii="Apple SD Gothic Neo" w:hAnsi="Apple SD Gothic Neo" w:eastAsia="Apple SD Gothic Neo"/>
+                <w:b w:val="0"/>
+                <w:color w:val="17211D"/>
+                <w:sz w:val="18"/>
+              </w:rPr>
+              <w:t>워크숍 project brief 산출물</w:t>
+            </w:r>
+          </w:p>
+        </w:tc>
+      </w:tr>
+      <w:tr>
+        <w:trPr>
+          <w:cantSplit/>
+        </w:trPr>
+        <w:tc>
+          <w:tcPr>
+            <w:tcW w:type="dxa" w:w="2650"/>
+            <w:vAlign w:val="center"/>
+          </w:tcPr>
+          <w:p>
+            <w:pPr>
+              <w:spacing w:before="0" w:after="0" w:line="276" w:lineRule="auto"/>
+              <w:jc w:val="left"/>
+            </w:pPr>
+            <w:r/>
+            <w:r>
+              <w:rPr>
+                <w:rFonts w:ascii="Apple SD Gothic Neo" w:hAnsi="Apple SD Gothic Neo" w:eastAsia="Apple SD Gothic Neo"/>
+                <w:b w:val="0"/>
+                <w:color w:val="17211D"/>
+                <w:sz w:val="18"/>
+              </w:rPr>
+              <w:t>docs/baseline_plan.md</w:t>
+            </w:r>
+          </w:p>
+        </w:tc>
+        <w:tc>
+          <w:tcPr>
+            <w:tcW w:type="dxa" w:w="4210"/>
+            <w:vAlign w:val="center"/>
+          </w:tcPr>
+          <w:p>
+            <w:pPr>
+              <w:spacing w:before="0" w:after="0" w:line="276" w:lineRule="auto"/>
+              <w:jc w:val="left"/>
+            </w:pPr>
+            <w:r/>
+            <w:r>
+              <w:rPr>
+                <w:rFonts w:ascii="Apple SD Gothic Neo" w:hAnsi="Apple SD Gothic Neo" w:eastAsia="Apple SD Gothic Neo"/>
+                <w:b w:val="0"/>
+                <w:color w:val="17211D"/>
+                <w:sz w:val="18"/>
+              </w:rPr>
+              <w:t>baseline model, split, metric, tracking 계획</w:t>
+            </w:r>
+          </w:p>
+        </w:tc>
+        <w:tc>
+          <w:tcPr>
+            <w:tcW w:type="dxa" w:w="2500"/>
+            <w:vAlign w:val="center"/>
+          </w:tcPr>
+          <w:p>
+            <w:pPr>
+              <w:spacing w:before="0" w:after="0" w:line="276" w:lineRule="auto"/>
+              <w:jc w:val="left"/>
+            </w:pPr>
+            <w:r/>
+            <w:r>
+              <w:rPr>
+                <w:rFonts w:ascii="Apple SD Gothic Neo" w:hAnsi="Apple SD Gothic Neo" w:eastAsia="Apple SD Gothic Neo"/>
+                <w:b w:val="0"/>
+                <w:color w:val="17211D"/>
+                <w:sz w:val="18"/>
+              </w:rPr>
+              <w:t>워크숍 baseline plan 산출물</w:t>
+            </w:r>
+          </w:p>
+        </w:tc>
+      </w:tr>
+      <w:tr>
+        <w:trPr>
+          <w:cantSplit/>
+        </w:trPr>
+        <w:tc>
+          <w:tcPr>
+            <w:tcW w:type="dxa" w:w="2650"/>
+            <w:vAlign w:val="center"/>
+          </w:tcPr>
+          <w:p>
+            <w:pPr>
+              <w:spacing w:before="0" w:after="0" w:line="276" w:lineRule="auto"/>
+              <w:jc w:val="left"/>
+            </w:pPr>
+            <w:r/>
+            <w:r>
+              <w:rPr>
+                <w:rFonts w:ascii="Apple SD Gothic Neo" w:hAnsi="Apple SD Gothic Neo" w:eastAsia="Apple SD Gothic Neo"/>
+                <w:b w:val="0"/>
+                <w:color w:val="17211D"/>
+                <w:sz w:val="18"/>
+              </w:rPr>
+              <w:t>docs/data_version_strategy.md</w:t>
+            </w:r>
+          </w:p>
+        </w:tc>
+        <w:tc>
+          <w:tcPr>
+            <w:tcW w:type="dxa" w:w="4210"/>
+            <w:vAlign w:val="center"/>
+          </w:tcPr>
+          <w:p>
+            <w:pPr>
+              <w:spacing w:before="0" w:after="0" w:line="276" w:lineRule="auto"/>
+              <w:jc w:val="left"/>
+            </w:pPr>
+            <w:r/>
+            <w:r>
+              <w:rPr>
+                <w:rFonts w:ascii="Apple SD Gothic Neo" w:hAnsi="Apple SD Gothic Neo" w:eastAsia="Apple SD Gothic Neo"/>
+                <w:b w:val="0"/>
+                <w:color w:val="17211D"/>
+                <w:sz w:val="18"/>
+              </w:rPr>
+              <w:t>raw/processed/features 버전 관리 전략</w:t>
+            </w:r>
+          </w:p>
+        </w:tc>
+        <w:tc>
+          <w:tcPr>
+            <w:tcW w:type="dxa" w:w="2500"/>
+            <w:vAlign w:val="center"/>
+          </w:tcPr>
+          <w:p>
+            <w:pPr>
+              <w:spacing w:before="0" w:after="0" w:line="276" w:lineRule="auto"/>
+              <w:jc w:val="left"/>
+            </w:pPr>
+            <w:r/>
+            <w:r>
+              <w:rPr>
+                <w:rFonts w:ascii="Apple SD Gothic Neo" w:hAnsi="Apple SD Gothic Neo" w:eastAsia="Apple SD Gothic Neo"/>
+                <w:b w:val="0"/>
+                <w:color w:val="17211D"/>
+                <w:sz w:val="18"/>
+              </w:rPr>
+              <w:t>데이터 재현성 산출물</w:t>
+            </w:r>
+          </w:p>
+        </w:tc>
+      </w:tr>
+      <w:tr>
+        <w:trPr>
+          <w:cantSplit/>
+        </w:trPr>
+        <w:tc>
+          <w:tcPr>
+            <w:tcW w:type="dxa" w:w="2650"/>
+            <w:vAlign w:val="center"/>
+          </w:tcPr>
+          <w:p>
+            <w:pPr>
+              <w:spacing w:before="0" w:after="0" w:line="276" w:lineRule="auto"/>
+              <w:jc w:val="left"/>
+            </w:pPr>
+            <w:r/>
+            <w:r>
+              <w:rPr>
+                <w:rFonts w:ascii="Apple SD Gothic Neo" w:hAnsi="Apple SD Gothic Neo" w:eastAsia="Apple SD Gothic Neo"/>
+                <w:b w:val="0"/>
+                <w:color w:val="17211D"/>
+                <w:sz w:val="18"/>
+              </w:rPr>
+              <w:t>docs/final_presentation_outline.md</w:t>
+            </w:r>
+          </w:p>
+        </w:tc>
+        <w:tc>
+          <w:tcPr>
+            <w:tcW w:type="dxa" w:w="4210"/>
+            <w:vAlign w:val="center"/>
+          </w:tcPr>
+          <w:p>
+            <w:pPr>
+              <w:spacing w:before="0" w:after="0" w:line="276" w:lineRule="auto"/>
+              <w:jc w:val="left"/>
+            </w:pPr>
+            <w:r/>
+            <w:r>
+              <w:rPr>
+                <w:rFonts w:ascii="Apple SD Gothic Neo" w:hAnsi="Apple SD Gothic Neo" w:eastAsia="Apple SD Gothic Neo"/>
+                <w:b w:val="0"/>
+                <w:color w:val="17211D"/>
+                <w:sz w:val="18"/>
+              </w:rPr>
+              <w:t>최종 발표 slide outline</w:t>
+            </w:r>
+          </w:p>
+        </w:tc>
+        <w:tc>
+          <w:tcPr>
+            <w:tcW w:type="dxa" w:w="2500"/>
+            <w:vAlign w:val="center"/>
+          </w:tcPr>
+          <w:p>
+            <w:pPr>
+              <w:spacing w:before="0" w:after="0" w:line="276" w:lineRule="auto"/>
+              <w:jc w:val="left"/>
+            </w:pPr>
+            <w:r/>
+            <w:r>
+              <w:rPr>
+                <w:rFonts w:ascii="Apple SD Gothic Neo" w:hAnsi="Apple SD Gothic Neo" w:eastAsia="Apple SD Gothic Neo"/>
+                <w:b w:val="0"/>
+                <w:color w:val="17211D"/>
+                <w:sz w:val="18"/>
+              </w:rPr>
+              <w:t>발표 산출물</w:t>
             </w:r>
           </w:p>
         </w:tc>
@@ -7219,6 +7645,55 @@
                 <w:color w:val="17211D"/>
                 <w:sz w:val="18"/>
               </w:rPr>
+              <w:t>make capstone-check</w:t>
+            </w:r>
+          </w:p>
+        </w:tc>
+        <w:tc>
+          <w:tcPr>
+            <w:tcW w:type="dxa" w:w="6760"/>
+            <w:vAlign w:val="center"/>
+          </w:tcPr>
+          <w:p>
+            <w:pPr>
+              <w:spacing w:before="0" w:after="0" w:line="276" w:lineRule="auto"/>
+              <w:jc w:val="left"/>
+            </w:pPr>
+            <w:r/>
+            <w:r>
+              <w:rPr>
+                <w:rFonts w:ascii="Apple SD Gothic Neo" w:hAnsi="Apple SD Gothic Neo" w:eastAsia="Apple SD Gothic Neo"/>
+                <w:b w:val="0"/>
+                <w:color w:val="17211D"/>
+                <w:sz w:val="18"/>
+              </w:rPr>
+              <w:t>reports/capstone_requirements_check.md 생성</w:t>
+            </w:r>
+          </w:p>
+        </w:tc>
+      </w:tr>
+      <w:tr>
+        <w:trPr>
+          <w:cantSplit/>
+        </w:trPr>
+        <w:tc>
+          <w:tcPr>
+            <w:tcW w:type="dxa" w:w="2600"/>
+            <w:vAlign w:val="center"/>
+          </w:tcPr>
+          <w:p>
+            <w:pPr>
+              <w:spacing w:before="0" w:after="0" w:line="276" w:lineRule="auto"/>
+              <w:jc w:val="left"/>
+            </w:pPr>
+            <w:r/>
+            <w:r>
+              <w:rPr>
+                <w:rFonts w:ascii="Apple SD Gothic Neo" w:hAnsi="Apple SD Gothic Neo" w:eastAsia="Apple SD Gothic Neo"/>
+                <w:b w:val="0"/>
+                <w:color w:val="17211D"/>
+                <w:sz w:val="18"/>
+              </w:rPr>
               <w:t>make docker-up</w:t>
             </w:r>
           </w:p>
@@ -8014,6 +8489,11 @@
       </w:pPr>
     </w:p>
     <w:p>
+      <w:r>
+        <w:br w:type="page"/>
+      </w:r>
+    </w:p>
+    <w:p>
       <w:pPr>
         <w:pStyle w:val="Heading1"/>
         <w:spacing w:before="280" w:after="120" w:line="300" w:lineRule="auto"/>
@@ -8325,6 +8805,55 @@
                 <w:color w:val="17211D"/>
                 <w:sz w:val="18"/>
               </w:rPr>
+              <w:t>make capstone-check</w:t>
+            </w:r>
+          </w:p>
+        </w:tc>
+        <w:tc>
+          <w:tcPr>
+            <w:tcW w:type="dxa" w:w="6860"/>
+            <w:vAlign w:val="center"/>
+          </w:tcPr>
+          <w:p>
+            <w:pPr>
+              <w:spacing w:before="0" w:after="0" w:line="276" w:lineRule="auto"/>
+              <w:jc w:val="left"/>
+            </w:pPr>
+            <w:r/>
+            <w:r>
+              <w:rPr>
+                <w:rFonts w:ascii="Apple SD Gothic Neo" w:hAnsi="Apple SD Gothic Neo" w:eastAsia="Apple SD Gothic Neo"/>
+                <w:b w:val="0"/>
+                <w:color w:val="17211D"/>
+                <w:sz w:val="18"/>
+              </w:rPr>
+              <w:t>reports/capstone_requirements_check.md 생성 성공</w:t>
+            </w:r>
+          </w:p>
+        </w:tc>
+      </w:tr>
+      <w:tr>
+        <w:trPr>
+          <w:cantSplit/>
+        </w:trPr>
+        <w:tc>
+          <w:tcPr>
+            <w:tcW w:type="dxa" w:w="2500"/>
+            <w:vAlign w:val="center"/>
+          </w:tcPr>
+          <w:p>
+            <w:pPr>
+              <w:spacing w:before="0" w:after="0" w:line="276" w:lineRule="auto"/>
+              <w:jc w:val="left"/>
+            </w:pPr>
+            <w:r/>
+            <w:r>
+              <w:rPr>
+                <w:rFonts w:ascii="Apple SD Gothic Neo" w:hAnsi="Apple SD Gothic Neo" w:eastAsia="Apple SD Gothic Neo"/>
+                <w:b w:val="0"/>
+                <w:color w:val="17211D"/>
+                <w:sz w:val="18"/>
+              </w:rPr>
               <w:t>make pipeline</w:t>
             </w:r>
           </w:p>
@@ -8347,7 +8876,7 @@
                 <w:color w:val="17211D"/>
                 <w:sz w:val="18"/>
               </w:rPr>
-              <w:t>성공. metadata, model card, data card 갱신</w:t>
+              <w:t>성공. metadata, model card, data card, error analysis 갱신</w:t>
             </w:r>
           </w:p>
         </w:tc>

</xml_diff>

<commit_message>
Implement official data pipeline and dashboard redesign
</commit_message>
<xml_diff>
--- a/docs/RebootRoute_Project_Report.docx
+++ b/docs/RebootRoute_Project_Report.docx
@@ -440,7 +440,7 @@
           <w:rFonts w:ascii="Apple SD Gothic Neo" w:hAnsi="Apple SD Gothic Neo" w:eastAsia="Apple SD Gothic Neo"/>
           <w:color w:val="17211D"/>
         </w:rPr>
-        <w:t>현재 핵심 축은 공식 출처 기반 resource seed, local TF-IDF RAG, 부담도 기반 다음 행동 제안입니다.</w:t>
+        <w:t>현재 핵심 축은 공식 출처 HTML 수집 resource, local TF-IDF RAG, 부담도 기반 다음 행동 제안입니다.</w:t>
       </w:r>
     </w:p>
     <w:p>
@@ -524,7 +524,7 @@
           <w:b w:val="0"/>
           <w:color w:val="17211D"/>
         </w:rPr>
-        <w:t>대시보드의 첫 탭은 실제 사용자가 무엇을 먼저 보고 무엇을 얻는지 명확히 알 수 있도록 네 단계로 재구성했습니다. 조건을 변경하면 추천 루트, 미션, 자원 후보, 지도 위치가 즉시 갱신되며, 별도 업데이트 버튼이나 추천 루트 버튼을 누르지 않습니다.</w:t>
+        <w:t>대시보드의 첫 탭은 실제 사용자가 무엇을 먼저 보고 무엇을 얻는지 명확히 알 수 있도록 네 단계로 재구성했습니다. 조건을 변경하면 추천 미션, 자원 후보, 지도 위치가 즉시 갱신되며, 별도 업데이트 버튼이나 추천 루트 버튼을 누르지 않습니다.</w:t>
       </w:r>
     </w:p>
     <w:tbl>
@@ -1133,7 +1133,7 @@
                 <w:color w:val="17211D"/>
                 <w:sz w:val="18"/>
               </w:rPr>
-              <w:t>Sample data + official resource seed</w:t>
+              <w:t>Sample data + official resources</w:t>
             </w:r>
           </w:p>
         </w:tc>
@@ -1155,7 +1155,7 @@
                 <w:color w:val="17211D"/>
                 <w:sz w:val="18"/>
               </w:rPr>
-              <w:t>src/rebootroute/data/mock_data.py, data/raw/*.csv</w:t>
+              <w:t>scripts/fetch_official_resources.py, src/rebootroute/data/official_sources.py</w:t>
             </w:r>
           </w:p>
         </w:tc>
@@ -1177,7 +1177,7 @@
                 <w:color w:val="17211D"/>
                 <w:sz w:val="18"/>
               </w:rPr>
-              <w:t>Synthetic profile/progress와 공식 출처 기반 인천 자원 seed 생성</w:t>
+              <w:t>인천청년포털/인천문화재단 공개 HTML 수집</w:t>
             </w:r>
           </w:p>
         </w:tc>
@@ -1270,7 +1270,7 @@
                 <w:color w:val="17211D"/>
                 <w:sz w:val="18"/>
               </w:rPr>
-              <w:t>필수 column, 타입, 범위 검증. pandera 미설치 시 fallback</w:t>
+              <w:t>필수 column, 타입, 범위, 출처 provenance, 의심 문구 검증</w:t>
             </w:r>
           </w:p>
         </w:tc>
@@ -2305,7 +2305,7 @@
                 <w:color w:val="17211D"/>
                 <w:sz w:val="18"/>
               </w:rPr>
-              <w:t>Streamlit 대시보드. 오늘 루트, 자원·지도, 기록, 검증 탭</w:t>
+              <w:t>Streamlit 대시보드. 기본 사용자 탭은 내 루트, 정책·문화 찾기, 내 기록이며 URL 쿼리 ?operator=1에서만 운영자 검증 탭 표시</w:t>
             </w:r>
           </w:p>
         </w:tc>
@@ -2354,7 +2354,7 @@
                 <w:color w:val="17211D"/>
                 <w:sz w:val="18"/>
               </w:rPr>
-              <w:t>Synthetic sample 생성, 공식 resource seed 생성, validation</w:t>
+              <w:t>Synthetic sample 생성, 공식 HTML 수집, fallback seed, validation</w:t>
             </w:r>
           </w:p>
         </w:tc>
@@ -2953,7 +2953,7 @@
                 <w:color w:val="17211D"/>
                 <w:sz w:val="18"/>
               </w:rPr>
-              <w:t>공식 출처 기반 인천 자원 seed</w:t>
+              <w:t>공식 출처 기반 인천 자원</w:t>
             </w:r>
           </w:p>
         </w:tc>
@@ -2975,7 +2975,7 @@
                 <w:color w:val="17211D"/>
                 <w:sz w:val="18"/>
               </w:rPr>
-              <w:t>인천청년포털, 인천문화재단, 인천아트플랫폼, 트라이보울 등</w:t>
+              <w:t>인천청년포털 청년정책/프로그램/공간대관, 인천문화재단 문화행사</w:t>
             </w:r>
           </w:p>
         </w:tc>
@@ -4429,7 +4429,7 @@
           <w:rFonts w:ascii="Apple SD Gothic Neo" w:hAnsi="Apple SD Gothic Neo" w:eastAsia="Apple SD Gothic Neo"/>
           <w:color w:val="17211D"/>
         </w:rPr>
-        <w:t>기본 검색 대상은 youth_program, culture_event, culture_facility, support_program, contest, mini_project입니다.</w:t>
+        <w:t>기본 검색 대상은 youth_program, culture_event, culture_facility, support_program입니다.</w:t>
       </w:r>
     </w:p>
     <w:p>
@@ -5531,7 +5531,7 @@
                 <w:color w:val="17211D"/>
                 <w:sz w:val="18"/>
               </w:rPr>
-              <w:t>검증</w:t>
+              <w:t>운영자 검증</w:t>
             </w:r>
           </w:p>
         </w:tc>
@@ -5575,7 +5575,7 @@
                 <w:color w:val="17211D"/>
                 <w:sz w:val="18"/>
               </w:rPr>
-              <w:t>Rule stage, ML 보조 stage, contributing factors, IDs, score, raw payload, feedback/progress/outcome log, 운영자 review 입력, 모델 metric 확인</w:t>
+              <w:t>URL 쿼리 ?operator=1에서만 Rule stage, ML 보조 stage, contributing factors, IDs, score, raw payload, feedback/progress/outcome log, 운영자 review 입력, 모델 metric 확인</w:t>
             </w:r>
           </w:p>
         </w:tc>
@@ -5639,7 +5639,7 @@
           <w:rFonts w:ascii="Apple SD Gothic Neo" w:hAnsi="Apple SD Gothic Neo" w:eastAsia="Apple SD Gothic Neo"/>
           <w:color w:val="17211D"/>
         </w:rPr>
-        <w:t>사용자 화면에는 내부 ranking score, 식별자, point를 숨기고, 검증 탭에서만 표로 공개합니다.</w:t>
+        <w:t>사용자 화면에는 내부 ranking score, 식별자, point를 숨기고, URL 쿼리 ?operator=1 운영자 검증 탭에서만 표로 공개합니다.</w:t>
       </w:r>
     </w:p>
     <w:p>
@@ -7400,6 +7400,55 @@
                 <w:color w:val="17211D"/>
                 <w:sz w:val="18"/>
               </w:rPr>
+              <w:t>make official-data</w:t>
+            </w:r>
+          </w:p>
+        </w:tc>
+        <w:tc>
+          <w:tcPr>
+            <w:tcW w:type="dxa" w:w="6760"/>
+            <w:vAlign w:val="center"/>
+          </w:tcPr>
+          <w:p>
+            <w:pPr>
+              <w:spacing w:before="0" w:after="0" w:line="276" w:lineRule="auto"/>
+              <w:jc w:val="left"/>
+            </w:pPr>
+            <w:r/>
+            <w:r>
+              <w:rPr>
+                <w:rFonts w:ascii="Apple SD Gothic Neo" w:hAnsi="Apple SD Gothic Neo" w:eastAsia="Apple SD Gothic Neo"/>
+                <w:b w:val="0"/>
+                <w:color w:val="17211D"/>
+                <w:sz w:val="18"/>
+              </w:rPr>
+              <w:t>인천청년포털/인천문화재단 공식 HTML 수집, sample_resources.csv와 resource_audit.md 갱신</w:t>
+            </w:r>
+          </w:p>
+        </w:tc>
+      </w:tr>
+      <w:tr>
+        <w:trPr>
+          <w:cantSplit/>
+        </w:trPr>
+        <w:tc>
+          <w:tcPr>
+            <w:tcW w:type="dxa" w:w="2600"/>
+            <w:vAlign w:val="center"/>
+          </w:tcPr>
+          <w:p>
+            <w:pPr>
+              <w:spacing w:before="0" w:after="0" w:line="276" w:lineRule="auto"/>
+              <w:jc w:val="left"/>
+            </w:pPr>
+            <w:r/>
+            <w:r>
+              <w:rPr>
+                <w:rFonts w:ascii="Apple SD Gothic Neo" w:hAnsi="Apple SD Gothic Neo" w:eastAsia="Apple SD Gothic Neo"/>
+                <w:b w:val="0"/>
+                <w:color w:val="17211D"/>
+                <w:sz w:val="18"/>
+              </w:rPr>
               <w:t>make pipeline</w:t>
             </w:r>
           </w:p>
@@ -7422,7 +7471,7 @@
                 <w:color w:val="17211D"/>
                 <w:sz w:val="18"/>
               </w:rPr>
-              <w:t>synthetic sample과 공식 resource seed 생성, validation, feature build, model training, DB init, reports 생성</w:t>
+              <w:t>synthetic sample 생성, 기존 공식 resource 보존, validation, feature build, model training, DB init, reports 생성</w:t>
             </w:r>
           </w:p>
         </w:tc>
@@ -7865,7 +7914,7 @@
           <w:rFonts w:ascii="Apple SD Gothic Neo" w:hAnsi="Apple SD Gothic Neo" w:eastAsia="Apple SD Gothic Neo"/>
           <w:color w:val="17211D"/>
         </w:rPr>
-        <w:t>검증 탭에서 mission_id, resource_id, score, raw payload, feedback/outcome log가 내부 검증용으로만 보이는 것을 확인한다.</w:t>
+        <w:t>URL 쿼리 ?operator=1 운영자 검증 탭에서 mission_id, resource_id, score, raw payload, feedback/outcome log가 내부 검증용으로만 보이는 것을 확인한다.</w:t>
       </w:r>
     </w:p>
     <w:p>
@@ -8029,7 +8078,7 @@
                 <w:color w:val="17211D"/>
                 <w:sz w:val="18"/>
               </w:rPr>
-              <w:t>공식 출처 기반 curated seed</w:t>
+              <w:t>공개 HTML 수집기 구현</w:t>
             </w:r>
           </w:p>
         </w:tc>
@@ -8051,7 +8100,7 @@
                 <w:color w:val="17211D"/>
                 <w:sz w:val="18"/>
               </w:rPr>
-              <w:t>자동 동기화 또는 운영자 검수형 갱신 프로세스 설계</w:t>
+              <w:t>DOM 변경 감지, API key 운영, 주기 수집 및 운영자 검수 설계</w:t>
             </w:r>
           </w:p>
         </w:tc>
@@ -8533,7 +8582,7 @@
           <w:rFonts w:ascii="Apple SD Gothic Neo" w:hAnsi="Apple SD Gothic Neo" w:eastAsia="Apple SD Gothic Neo"/>
           <w:color w:val="17211D"/>
         </w:rPr>
-        <w:t>현재 resource는 공식 출처 기반 seed이지만 자동 크롤링/공공 API 동기화는 아직 없습니다.</w:t>
+        <w:t>현재 resource는 공개 공식 HTML 수집 결과입니다. 다만 사이트 DOM이 바뀌면 파서를 갱신해야 하며, 운영 전에는 주기 수집/검수 프로세스가 필요합니다.</w:t>
       </w:r>
     </w:p>
     <w:p>
@@ -8729,7 +8778,7 @@
                 <w:color w:val="17211D"/>
                 <w:sz w:val="18"/>
               </w:rPr>
-              <w:t>11 passed</w:t>
+              <w:t>16 passed</w:t>
             </w:r>
           </w:p>
         </w:tc>

</xml_diff>

<commit_message>
Build official resources and synthetic outcome data
</commit_message>
<xml_diff>
--- a/docs/RebootRoute_Project_Report.docx
+++ b/docs/RebootRoute_Project_Report.docx
@@ -287,7 +287,7 @@
                 <w:color w:val="17211D"/>
                 <w:sz w:val="18"/>
               </w:rPr>
-              <w:t>2026-06-08</w:t>
+              <w:t>2026-06-09</w:t>
             </w:r>
           </w:p>
         </w:tc>
@@ -2811,7 +2811,7 @@
                 <w:color w:val="17211D"/>
                 <w:sz w:val="18"/>
               </w:rPr>
-              <w:t>180개 synthetic profile</w:t>
+              <w:t>1000개 synthetic profile</w:t>
             </w:r>
           </w:p>
         </w:tc>
@@ -3095,7 +3095,7 @@
                 <w:color w:val="17211D"/>
                 <w:sz w:val="18"/>
               </w:rPr>
-              <w:t>outcome import template</w:t>
+              <w:t>synthetic outcome event 1300건 내외</w:t>
             </w:r>
           </w:p>
         </w:tc>
@@ -3117,7 +3117,7 @@
                 <w:color w:val="17211D"/>
                 <w:sz w:val="18"/>
               </w:rPr>
-              <w:t>실제 outcome row는 사용자 또는 기관 관측 후 입력</w:t>
+              <w:t>실제 참여/지원 결과가 아님</w:t>
             </w:r>
           </w:p>
         </w:tc>
@@ -6844,7 +6844,7 @@
                 <w:color w:val="17211D"/>
                 <w:sz w:val="18"/>
               </w:rPr>
-              <w:t>gradient_boosting</w:t>
+              <w:t>random_forest</w:t>
             </w:r>
           </w:p>
         </w:tc>
@@ -6942,7 +6942,7 @@
                 <w:color w:val="17211D"/>
                 <w:sz w:val="18"/>
               </w:rPr>
-              <w:t>03084bbbcc1e8b4f</w:t>
+              <w:t>d2a7440a96209a42</w:t>
             </w:r>
           </w:p>
         </w:tc>
@@ -6991,7 +6991,7 @@
                 <w:color w:val="17211D"/>
                 <w:sz w:val="18"/>
               </w:rPr>
-              <w:t>0.7111111111111111 / 0.6538690476190476</w:t>
+              <w:t>0.856 / 0.8086926454634507</w:t>
             </w:r>
           </w:p>
         </w:tc>
@@ -7040,7 +7040,7 @@
                 <w:color w:val="17211D"/>
                 <w:sz w:val="18"/>
               </w:rPr>
-              <w:t>0.8222222222222222 / 0.8221343873517787 / 0.9407114624505929</w:t>
+              <w:t>0.84 / 0.839166237776634 / 0.9222415011888696</w:t>
             </w:r>
           </w:p>
         </w:tc>

</xml_diff>

<commit_message>
Update RebootRoute docs and dashboard UX
</commit_message>
<xml_diff>
--- a/docs/RebootRoute_Project_Report.docx
+++ b/docs/RebootRoute_Project_Report.docx
@@ -287,7 +287,7 @@
                 <w:color w:val="17211D"/>
                 <w:sz w:val="18"/>
               </w:rPr>
-              <w:t>2026-06-09</w:t>
+              <w:t>2026-06-13</w:t>
             </w:r>
           </w:p>
         </w:tc>
@@ -524,7 +524,7 @@
           <w:b w:val="0"/>
           <w:color w:val="17211D"/>
         </w:rPr>
-        <w:t>대시보드의 첫 탭은 실제 사용자가 무엇을 먼저 보고 무엇을 얻는지 명확히 알 수 있도록 네 단계로 재구성했습니다. 조건을 변경하면 추천 미션, 자원 후보, 지도 위치가 즉시 갱신되며, 별도 업데이트 버튼이나 추천 루트 버튼을 누르지 않습니다.</w:t>
+        <w:t>대시보드는 사용자가 먼저 서비스 범위와 공식 자료를 확인한 뒤 조건을 고르는 구조입니다. 네 조건이 모두 선택되기 전에는 추천 결과를 확정해서 보여주지 않고, 조건이 완성되면 추천 미션, 자원 후보, 지도 위치가 즉시 갱신됩니다. 별도 업데이트 버튼이나 재추천 버튼을 누르지 않습니다.</w:t>
       </w:r>
     </w:p>
     <w:tbl>
@@ -659,7 +659,7 @@
                 <w:color w:val="17211D"/>
                 <w:sz w:val="18"/>
               </w:rPr>
-              <w:t>내 조건 입력</w:t>
+              <w:t>Hero와 프로젝트 설명 확인</w:t>
             </w:r>
           </w:p>
         </w:tc>
@@ -681,7 +681,7 @@
                 <w:color w:val="17211D"/>
                 <w:sz w:val="18"/>
               </w:rPr>
-              <w:t>위치, 외출 가능 시간, 비용, 대면 부담, 관심 분야</w:t>
+              <w:t>공식 자료 기반 낮은 부담 행동 추천 MVP라는 서비스 범위</w:t>
             </w:r>
           </w:p>
         </w:tc>
@@ -730,7 +730,7 @@
                 <w:color w:val="17211D"/>
                 <w:sz w:val="18"/>
               </w:rPr>
-              <w:t>추천 루트 확인</w:t>
+              <w:t>조건 선택 전에 볼 공식 자료 확인</w:t>
             </w:r>
           </w:p>
         </w:tc>
@@ -752,7 +752,7 @@
                 <w:color w:val="17211D"/>
                 <w:sz w:val="18"/>
               </w:rPr>
-              <w:t>현재 부담도에 맞는 단계와 오늘 할 미션</w:t>
+              <w:t>인천 청년정책, 청년공간, 문화행사, 프로그램 preview</w:t>
             </w:r>
           </w:p>
         </w:tc>
@@ -801,7 +801,7 @@
                 <w:color w:val="17211D"/>
                 <w:sz w:val="18"/>
               </w:rPr>
-              <w:t>지도 확인</w:t>
+              <w:t>네 가지 조건 선택</w:t>
             </w:r>
           </w:p>
         </w:tc>
@@ -823,7 +823,7 @@
                 <w:color w:val="17211D"/>
                 <w:sz w:val="18"/>
               </w:rPr>
-              <w:t>내 위치와 활동 장소의 상대 위치, 대략 직선거리</w:t>
+              <w:t>오늘 쓸 수 있는 시간, 사람 만나는 부담, 먼저 볼 자료, 비용 범위</w:t>
             </w:r>
           </w:p>
         </w:tc>
@@ -851,6 +851,77 @@
                 <w:sz w:val="18"/>
               </w:rPr>
               <w:t>4</w:t>
+            </w:r>
+          </w:p>
+        </w:tc>
+        <w:tc>
+          <w:tcPr>
+            <w:tcW w:type="dxa" w:w="3200"/>
+            <w:vAlign w:val="center"/>
+          </w:tcPr>
+          <w:p>
+            <w:pPr>
+              <w:spacing w:before="0" w:after="0" w:line="276" w:lineRule="auto"/>
+              <w:jc w:val="left"/>
+            </w:pPr>
+            <w:r/>
+            <w:r>
+              <w:rPr>
+                <w:rFonts w:ascii="Apple SD Gothic Neo" w:hAnsi="Apple SD Gothic Neo" w:eastAsia="Apple SD Gothic Neo"/>
+                <w:b w:val="0"/>
+                <w:color w:val="17211D"/>
+                <w:sz w:val="18"/>
+              </w:rPr>
+              <w:t>오늘 루트 확인</w:t>
+            </w:r>
+          </w:p>
+        </w:tc>
+        <w:tc>
+          <w:tcPr>
+            <w:tcW w:type="dxa" w:w="5260"/>
+            <w:vAlign w:val="center"/>
+          </w:tcPr>
+          <w:p>
+            <w:pPr>
+              <w:spacing w:before="0" w:after="0" w:line="276" w:lineRule="auto"/>
+              <w:jc w:val="left"/>
+            </w:pPr>
+            <w:r/>
+            <w:r>
+              <w:rPr>
+                <w:rFonts w:ascii="Apple SD Gothic Neo" w:hAnsi="Apple SD Gothic Neo" w:eastAsia="Apple SD Gothic Neo"/>
+                <w:b w:val="0"/>
+                <w:color w:val="17211D"/>
+                <w:sz w:val="18"/>
+              </w:rPr>
+              <w:t>오늘 할 미션, 가장 맞는 공식 자료, 지도 안내</w:t>
+            </w:r>
+          </w:p>
+        </w:tc>
+      </w:tr>
+      <w:tr>
+        <w:trPr>
+          <w:cantSplit/>
+        </w:trPr>
+        <w:tc>
+          <w:tcPr>
+            <w:tcW w:type="dxa" w:w="900"/>
+            <w:vAlign w:val="center"/>
+          </w:tcPr>
+          <w:p>
+            <w:pPr>
+              <w:spacing w:before="0" w:after="0" w:line="276" w:lineRule="auto"/>
+              <w:jc w:val="left"/>
+            </w:pPr>
+            <w:r/>
+            <w:r>
+              <w:rPr>
+                <w:rFonts w:ascii="Apple SD Gothic Neo" w:hAnsi="Apple SD Gothic Neo" w:eastAsia="Apple SD Gothic Neo"/>
+                <w:b w:val="0"/>
+                <w:color w:val="17211D"/>
+                <w:sz w:val="18"/>
+              </w:rPr>
+              <w:t>5</w:t>
             </w:r>
           </w:p>
         </w:tc>
@@ -956,11 +1027,6 @@
       <w:pPr>
         <w:spacing w:before="0" w:after="80" w:line="300" w:lineRule="auto"/>
       </w:pPr>
-    </w:p>
-    <w:p>
-      <w:r>
-        <w:br w:type="page"/>
-      </w:r>
     </w:p>
     <w:p>
       <w:pPr>
@@ -1735,7 +1801,7 @@
                 <w:color w:val="17211D"/>
                 <w:sz w:val="18"/>
               </w:rPr>
-              <w:t>FastAPI와 Streamlit 오늘 루트/자원·지도/기록/검증 화면</w:t>
+              <w:t>FastAPI와 Streamlit hero/공식자료 preview/오늘 루트/검색/기록/운영자 검증 화면</w:t>
             </w:r>
           </w:p>
         </w:tc>
@@ -1931,11 +1997,6 @@
       <w:pPr>
         <w:spacing w:before="0" w:after="80" w:line="300" w:lineRule="auto"/>
       </w:pPr>
-    </w:p>
-    <w:p>
-      <w:r>
-        <w:br w:type="page"/>
-      </w:r>
     </w:p>
     <w:p>
       <w:pPr>
@@ -2305,7 +2366,252 @@
                 <w:color w:val="17211D"/>
                 <w:sz w:val="18"/>
               </w:rPr>
-              <w:t>Streamlit 대시보드. 기본 사용자 탭은 내 루트, 정책·문화 찾기, 내 기록이며 URL 쿼리 ?operator=1에서만 운영자 검증 탭 표시</w:t>
+              <w:t>Streamlit page orchestration. hero, 프로젝트 설명, 공식 자료 preview, 기본 탭, ?operator=1 운영자 패널 순서 렌더링</w:t>
+            </w:r>
+          </w:p>
+        </w:tc>
+      </w:tr>
+      <w:tr>
+        <w:trPr>
+          <w:cantSplit/>
+        </w:trPr>
+        <w:tc>
+          <w:tcPr>
+            <w:tcW w:type="dxa" w:w="3500"/>
+            <w:vAlign w:val="center"/>
+          </w:tcPr>
+          <w:p>
+            <w:pPr>
+              <w:spacing w:before="0" w:after="0" w:line="276" w:lineRule="auto"/>
+              <w:jc w:val="left"/>
+            </w:pPr>
+            <w:r/>
+            <w:r>
+              <w:rPr>
+                <w:rFonts w:ascii="Apple SD Gothic Neo" w:hAnsi="Apple SD Gothic Neo" w:eastAsia="Apple SD Gothic Neo"/>
+                <w:b w:val="0"/>
+                <w:color w:val="17211D"/>
+                <w:sz w:val="18"/>
+              </w:rPr>
+              <w:t>src/rebootroute/dashboard/components/*.py</w:t>
+            </w:r>
+          </w:p>
+        </w:tc>
+        <w:tc>
+          <w:tcPr>
+            <w:tcW w:type="dxa" w:w="5860"/>
+            <w:vAlign w:val="center"/>
+          </w:tcPr>
+          <w:p>
+            <w:pPr>
+              <w:spacing w:before="0" w:after="0" w:line="276" w:lineRule="auto"/>
+              <w:jc w:val="left"/>
+            </w:pPr>
+            <w:r/>
+            <w:r>
+              <w:rPr>
+                <w:rFonts w:ascii="Apple SD Gothic Neo" w:hAnsi="Apple SD Gothic Neo" w:eastAsia="Apple SD Gothic Neo"/>
+                <w:b w:val="0"/>
+                <w:color w:val="17211D"/>
+                <w:sz w:val="18"/>
+              </w:rPr>
+              <w:t>버튼, 카드, hero/footer layout component</w:t>
+            </w:r>
+          </w:p>
+        </w:tc>
+      </w:tr>
+      <w:tr>
+        <w:trPr>
+          <w:cantSplit/>
+        </w:trPr>
+        <w:tc>
+          <w:tcPr>
+            <w:tcW w:type="dxa" w:w="3500"/>
+            <w:vAlign w:val="center"/>
+          </w:tcPr>
+          <w:p>
+            <w:pPr>
+              <w:spacing w:before="0" w:after="0" w:line="276" w:lineRule="auto"/>
+              <w:jc w:val="left"/>
+            </w:pPr>
+            <w:r/>
+            <w:r>
+              <w:rPr>
+                <w:rFonts w:ascii="Apple SD Gothic Neo" w:hAnsi="Apple SD Gothic Neo" w:eastAsia="Apple SD Gothic Neo"/>
+                <w:b w:val="0"/>
+                <w:color w:val="17211D"/>
+                <w:sz w:val="18"/>
+              </w:rPr>
+              <w:t>src/rebootroute/dashboard/views/*.py</w:t>
+            </w:r>
+          </w:p>
+        </w:tc>
+        <w:tc>
+          <w:tcPr>
+            <w:tcW w:type="dxa" w:w="5860"/>
+            <w:vAlign w:val="center"/>
+          </w:tcPr>
+          <w:p>
+            <w:pPr>
+              <w:spacing w:before="0" w:after="0" w:line="276" w:lineRule="auto"/>
+              <w:jc w:val="left"/>
+            </w:pPr>
+            <w:r/>
+            <w:r>
+              <w:rPr>
+                <w:rFonts w:ascii="Apple SD Gothic Neo" w:hAnsi="Apple SD Gothic Neo" w:eastAsia="Apple SD Gothic Neo"/>
+                <w:b w:val="0"/>
+                <w:color w:val="17211D"/>
+                <w:sz w:val="18"/>
+              </w:rPr>
+              <w:t>내 루트, 정책·문화 찾기, 내 기록, 운영자 검증 view</w:t>
+            </w:r>
+          </w:p>
+        </w:tc>
+      </w:tr>
+      <w:tr>
+        <w:trPr>
+          <w:cantSplit/>
+        </w:trPr>
+        <w:tc>
+          <w:tcPr>
+            <w:tcW w:type="dxa" w:w="3500"/>
+            <w:vAlign w:val="center"/>
+          </w:tcPr>
+          <w:p>
+            <w:pPr>
+              <w:spacing w:before="0" w:after="0" w:line="276" w:lineRule="auto"/>
+              <w:jc w:val="left"/>
+            </w:pPr>
+            <w:r/>
+            <w:r>
+              <w:rPr>
+                <w:rFonts w:ascii="Apple SD Gothic Neo" w:hAnsi="Apple SD Gothic Neo" w:eastAsia="Apple SD Gothic Neo"/>
+                <w:b w:val="0"/>
+                <w:color w:val="17211D"/>
+                <w:sz w:val="18"/>
+              </w:rPr>
+              <w:t>src/rebootroute/dashboard/styles.py</w:t>
+            </w:r>
+          </w:p>
+        </w:tc>
+        <w:tc>
+          <w:tcPr>
+            <w:tcW w:type="dxa" w:w="5860"/>
+            <w:vAlign w:val="center"/>
+          </w:tcPr>
+          <w:p>
+            <w:pPr>
+              <w:spacing w:before="0" w:after="0" w:line="276" w:lineRule="auto"/>
+              <w:jc w:val="left"/>
+            </w:pPr>
+            <w:r/>
+            <w:r>
+              <w:rPr>
+                <w:rFonts w:ascii="Apple SD Gothic Neo" w:hAnsi="Apple SD Gothic Neo" w:eastAsia="Apple SD Gothic Neo"/>
+                <w:b w:val="0"/>
+                <w:color w:val="17211D"/>
+                <w:sz w:val="18"/>
+              </w:rPr>
+              <w:t>역할별 CSS 파일을 읽어 Streamlit에 주입하는 loader</w:t>
+            </w:r>
+          </w:p>
+        </w:tc>
+      </w:tr>
+      <w:tr>
+        <w:trPr>
+          <w:cantSplit/>
+        </w:trPr>
+        <w:tc>
+          <w:tcPr>
+            <w:tcW w:type="dxa" w:w="3500"/>
+            <w:vAlign w:val="center"/>
+          </w:tcPr>
+          <w:p>
+            <w:pPr>
+              <w:spacing w:before="0" w:after="0" w:line="276" w:lineRule="auto"/>
+              <w:jc w:val="left"/>
+            </w:pPr>
+            <w:r/>
+            <w:r>
+              <w:rPr>
+                <w:rFonts w:ascii="Apple SD Gothic Neo" w:hAnsi="Apple SD Gothic Neo" w:eastAsia="Apple SD Gothic Neo"/>
+                <w:b w:val="0"/>
+                <w:color w:val="17211D"/>
+                <w:sz w:val="18"/>
+              </w:rPr>
+              <w:t>src/rebootroute/dashboard/css/*.css</w:t>
+            </w:r>
+          </w:p>
+        </w:tc>
+        <w:tc>
+          <w:tcPr>
+            <w:tcW w:type="dxa" w:w="5860"/>
+            <w:vAlign w:val="center"/>
+          </w:tcPr>
+          <w:p>
+            <w:pPr>
+              <w:spacing w:before="0" w:after="0" w:line="276" w:lineRule="auto"/>
+              <w:jc w:val="left"/>
+            </w:pPr>
+            <w:r/>
+            <w:r>
+              <w:rPr>
+                <w:rFonts w:ascii="Apple SD Gothic Neo" w:hAnsi="Apple SD Gothic Neo" w:eastAsia="Apple SD Gothic Neo"/>
+                <w:b w:val="0"/>
+                <w:color w:val="17211D"/>
+                <w:sz w:val="18"/>
+              </w:rPr>
+              <w:t>base, hero, navigation, resources, route, results, footer, responsive 스타일 분리</w:t>
+            </w:r>
+          </w:p>
+        </w:tc>
+      </w:tr>
+      <w:tr>
+        <w:trPr>
+          <w:cantSplit/>
+        </w:trPr>
+        <w:tc>
+          <w:tcPr>
+            <w:tcW w:type="dxa" w:w="3500"/>
+            <w:vAlign w:val="center"/>
+          </w:tcPr>
+          <w:p>
+            <w:pPr>
+              <w:spacing w:before="0" w:after="0" w:line="276" w:lineRule="auto"/>
+              <w:jc w:val="left"/>
+            </w:pPr>
+            <w:r/>
+            <w:r>
+              <w:rPr>
+                <w:rFonts w:ascii="Apple SD Gothic Neo" w:hAnsi="Apple SD Gothic Neo" w:eastAsia="Apple SD Gothic Neo"/>
+                <w:b w:val="0"/>
+                <w:color w:val="17211D"/>
+                <w:sz w:val="18"/>
+              </w:rPr>
+              <w:t>src/rebootroute/dashboard/assets/*.png</w:t>
+            </w:r>
+          </w:p>
+        </w:tc>
+        <w:tc>
+          <w:tcPr>
+            <w:tcW w:type="dxa" w:w="5860"/>
+            <w:vAlign w:val="center"/>
+          </w:tcPr>
+          <w:p>
+            <w:pPr>
+              <w:spacing w:before="0" w:after="0" w:line="276" w:lineRule="auto"/>
+              <w:jc w:val="left"/>
+            </w:pPr>
+            <w:r/>
+            <w:r>
+              <w:rPr>
+                <w:rFonts w:ascii="Apple SD Gothic Neo" w:hAnsi="Apple SD Gothic Neo" w:eastAsia="Apple SD Gothic Neo"/>
+                <w:b w:val="0"/>
+                <w:color w:val="17211D"/>
+                <w:sz w:val="18"/>
+              </w:rPr>
+              <w:t>hero와 fallback resource/route/map 이미지 asset</w:t>
             </w:r>
           </w:p>
         </w:tc>
@@ -2658,11 +2964,6 @@
       <w:pPr>
         <w:spacing w:before="0" w:after="80" w:line="300" w:lineRule="auto"/>
       </w:pPr>
-    </w:p>
-    <w:p>
-      <w:r>
-        <w:br w:type="page"/>
-      </w:r>
     </w:p>
     <w:p>
       <w:pPr>
@@ -5189,11 +5490,6 @@
       </w:pPr>
     </w:p>
     <w:p>
-      <w:r>
-        <w:br w:type="page"/>
-      </w:r>
-    </w:p>
-    <w:p>
       <w:pPr>
         <w:pStyle w:val="Heading1"/>
         <w:spacing w:before="280" w:after="120" w:line="300" w:lineRule="auto"/>
@@ -5245,7 +5541,7 @@
                 <w:color w:val="17211D"/>
                 <w:sz w:val="18"/>
               </w:rPr>
-              <w:t>탭</w:t>
+              <w:t>영역</w:t>
             </w:r>
           </w:p>
         </w:tc>
@@ -5318,7 +5614,7 @@
                 <w:color w:val="17211D"/>
                 <w:sz w:val="18"/>
               </w:rPr>
-              <w:t>오늘 루트</w:t>
+              <w:t>공통 상단</w:t>
             </w:r>
           </w:p>
         </w:tc>
@@ -5362,7 +5658,7 @@
                 <w:color w:val="17211D"/>
                 <w:sz w:val="18"/>
               </w:rPr>
-              <w:t>내 조건 입력 → 추천 루트 → 지도 → 미션/결과 기록. ID, score, point 숨김</w:t>
+              <w:t>Hero, 프로젝트 설명, 조건 선택 전에 볼 공식 자료 preview를 탭 위에 배치</w:t>
             </w:r>
           </w:p>
         </w:tc>
@@ -5389,7 +5685,7 @@
                 <w:color w:val="17211D"/>
                 <w:sz w:val="18"/>
               </w:rPr>
-              <w:t>자원·지도</w:t>
+              <w:t>내 루트</w:t>
             </w:r>
           </w:p>
         </w:tc>
@@ -5433,7 +5729,78 @@
                 <w:color w:val="17211D"/>
                 <w:sz w:val="18"/>
               </w:rPr>
-              <w:t>RAG 검색 결과를 자원 카드, 공식 출처 링크, 내 위치/활동 장소 지도 중심으로 표시</w:t>
+              <w:t>네 조건 선택 전에는 추천을 확정 노출하지 않고, 조건 완료 후 오늘 미션/공식 자료/지도/기록 버튼 표시</w:t>
+            </w:r>
+          </w:p>
+        </w:tc>
+      </w:tr>
+      <w:tr>
+        <w:trPr>
+          <w:cantSplit/>
+        </w:trPr>
+        <w:tc>
+          <w:tcPr>
+            <w:tcW w:type="dxa" w:w="1700"/>
+            <w:vAlign w:val="center"/>
+          </w:tcPr>
+          <w:p>
+            <w:pPr>
+              <w:spacing w:before="0" w:after="0" w:line="276" w:lineRule="auto"/>
+              <w:jc w:val="left"/>
+            </w:pPr>
+            <w:r/>
+            <w:r>
+              <w:rPr>
+                <w:rFonts w:ascii="Apple SD Gothic Neo" w:hAnsi="Apple SD Gothic Neo" w:eastAsia="Apple SD Gothic Neo"/>
+                <w:b w:val="0"/>
+                <w:color w:val="17211D"/>
+                <w:sz w:val="18"/>
+              </w:rPr>
+              <w:t>정책·문화 찾기</w:t>
+            </w:r>
+          </w:p>
+        </w:tc>
+        <w:tc>
+          <w:tcPr>
+            <w:tcW w:type="dxa" w:w="1900"/>
+            <w:vAlign w:val="center"/>
+          </w:tcPr>
+          <w:p>
+            <w:pPr>
+              <w:spacing w:before="0" w:after="0" w:line="276" w:lineRule="auto"/>
+              <w:jc w:val="left"/>
+            </w:pPr>
+            <w:r/>
+            <w:r>
+              <w:rPr>
+                <w:rFonts w:ascii="Apple SD Gothic Neo" w:hAnsi="Apple SD Gothic Neo" w:eastAsia="Apple SD Gothic Neo"/>
+                <w:b w:val="0"/>
+                <w:color w:val="17211D"/>
+                <w:sz w:val="18"/>
+              </w:rPr>
+              <w:t>실제 사용자</w:t>
+            </w:r>
+          </w:p>
+        </w:tc>
+        <w:tc>
+          <w:tcPr>
+            <w:tcW w:type="dxa" w:w="5760"/>
+            <w:vAlign w:val="center"/>
+          </w:tcPr>
+          <w:p>
+            <w:pPr>
+              <w:spacing w:before="0" w:after="0" w:line="276" w:lineRule="auto"/>
+              <w:jc w:val="left"/>
+            </w:pPr>
+            <w:r/>
+            <w:r>
+              <w:rPr>
+                <w:rFonts w:ascii="Apple SD Gothic Neo" w:hAnsi="Apple SD Gothic Neo" w:eastAsia="Apple SD Gothic Neo"/>
+                <w:b w:val="0"/>
+                <w:color w:val="17211D"/>
+                <w:sz w:val="18"/>
+              </w:rPr>
+              <w:t>RAG 검색 결과를 자원 카드, 공식 출처 링크, 지도 중심으로 표시</w:t>
             </w:r>
           </w:p>
         </w:tc>
@@ -5531,7 +5898,7 @@
                 <w:color w:val="17211D"/>
                 <w:sz w:val="18"/>
               </w:rPr>
-              <w:t>운영자 검증</w:t>
+              <w:t>개발자/운영자 검증</w:t>
             </w:r>
           </w:p>
         </w:tc>
@@ -5597,7 +5964,7 @@
           <w:rFonts w:ascii="Apple SD Gothic Neo" w:hAnsi="Apple SD Gothic Neo" w:eastAsia="Apple SD Gothic Neo"/>
           <w:color w:val="17211D"/>
         </w:rPr>
-        <w:t>첫 화면은 내 조건, 추천 루트, 지도, 결과 기록 순서로 보이도록 재구성했습니다.</w:t>
+        <w:t>첫 화면은 hero, 프로젝트 설명, 공식 자료 preview, 탭, 내 루트 순서로 보이도록 재구성했습니다.</w:t>
       </w:r>
     </w:p>
     <w:p>
@@ -5611,7 +5978,7 @@
           <w:rFonts w:ascii="Apple SD Gothic Neo" w:hAnsi="Apple SD Gothic Neo" w:eastAsia="Apple SD Gothic Neo"/>
           <w:color w:val="17211D"/>
         </w:rPr>
-        <w:t>조건 변경 즉시 추천 루트, 미션, 자원 후보, 지도 위치가 갱신됩니다.</w:t>
+        <w:t>네 조건 선택 전에는 추천 결과를 확정 노출하지 않고, 조건 완료 후 오늘 루트, 미션, 자원 후보, 지도 위치가 갱신됩니다.</w:t>
       </w:r>
     </w:p>
     <w:p>
@@ -5639,7 +6006,7 @@
           <w:rFonts w:ascii="Apple SD Gothic Neo" w:hAnsi="Apple SD Gothic Neo" w:eastAsia="Apple SD Gothic Neo"/>
           <w:color w:val="17211D"/>
         </w:rPr>
-        <w:t>사용자 화면에는 내부 ranking score, 식별자, point를 숨기고, URL 쿼리 ?operator=1 운영자 검증 탭에서만 표로 공개합니다.</w:t>
+        <w:t>사용자 화면에는 내부 ranking score, 식별자, point를 숨기고, URL 쿼리 ?operator=1 개발자/운영자 검증 화면에서만 표로 공개합니다.</w:t>
       </w:r>
     </w:p>
     <w:p>
@@ -5681,12 +6048,21 @@
           <w:rFonts w:ascii="Apple SD Gothic Neo" w:hAnsi="Apple SD Gothic Neo" w:eastAsia="Apple SD Gothic Neo"/>
           <w:color w:val="17211D"/>
         </w:rPr>
-        <w:t>모바일 폭에서는 단계 안내와 필터/카드가 한 열로 쌓이도록 반응형 CSS를 적용했습니다.</w:t>
+        <w:t>CSS는 base, hero, navigation, resources, route, results, footer, responsive 파일로 분리했습니다.</w:t>
       </w:r>
     </w:p>
     <w:p>
+      <w:pPr>
+        <w:pStyle w:val="ListBullet"/>
+        <w:spacing w:before="0" w:after="80" w:line="300" w:lineRule="auto"/>
+        <w:ind w:left="547" w:hanging="274"/>
+      </w:pPr>
       <w:r>
-        <w:br w:type="page"/>
+        <w:rPr>
+          <w:rFonts w:ascii="Apple SD Gothic Neo" w:hAnsi="Apple SD Gothic Neo" w:eastAsia="Apple SD Gothic Neo"/>
+          <w:color w:val="17211D"/>
+        </w:rPr>
+        <w:t>모바일 폭에서는 hero, official resource preview, 선택 panel, 결과 카드가 한 열로 쌓이도록 반응형 CSS를 적용했습니다.</w:t>
       </w:r>
     </w:p>
     <w:p>
@@ -7816,7 +8192,7 @@
           <w:rFonts w:ascii="Apple SD Gothic Neo" w:hAnsi="Apple SD Gothic Neo" w:eastAsia="Apple SD Gothic Neo"/>
           <w:color w:val="17211D"/>
         </w:rPr>
-        <w:t>오늘 루트 탭에서 내 조건 → 추천 루트 → 지도 → 결과 기록 순서가 보이는지 확인한다.</w:t>
+        <w:t>Hero, 프로젝트 설명, 조건 선택 전에 볼 공식 자료 preview가 탭 위에 보이는지 확인한다.</w:t>
       </w:r>
     </w:p>
     <w:p>
@@ -7830,7 +8206,35 @@
           <w:rFonts w:ascii="Apple SD Gothic Neo" w:hAnsi="Apple SD Gothic Neo" w:eastAsia="Apple SD Gothic Neo"/>
           <w:color w:val="17211D"/>
         </w:rPr>
-        <w:t>외출 부담, 대면 부담, 위치, 자원 종류, 비용, 최대 부담도를 바꿔 추천 미션과 자원 후보가 즉시 바뀌는 것을 보여준다.</w:t>
+        <w:t>내 루트 탭에서 오늘 쓸 수 있는 시간, 사람 만나는 부담, 먼저 볼 자료, 오늘 쓸 비용을 선택한다.</w:t>
+      </w:r>
+    </w:p>
+    <w:p>
+      <w:pPr>
+        <w:pStyle w:val="ListNumber"/>
+        <w:spacing w:before="0" w:after="80" w:line="300" w:lineRule="auto"/>
+        <w:ind w:left="547" w:hanging="274"/>
+      </w:pPr>
+      <w:r>
+        <w:rPr>
+          <w:rFonts w:ascii="Apple SD Gothic Neo" w:hAnsi="Apple SD Gothic Neo" w:eastAsia="Apple SD Gothic Neo"/>
+          <w:color w:val="17211D"/>
+        </w:rPr>
+        <w:t>네 조건이 모두 선택되기 전에는 추천 결과가 확정 노출되지 않는 것을 보여준다.</w:t>
+      </w:r>
+    </w:p>
+    <w:p>
+      <w:pPr>
+        <w:pStyle w:val="ListNumber"/>
+        <w:spacing w:before="0" w:after="80" w:line="300" w:lineRule="auto"/>
+        <w:ind w:left="547" w:hanging="274"/>
+      </w:pPr>
+      <w:r>
+        <w:rPr>
+          <w:rFonts w:ascii="Apple SD Gothic Neo" w:hAnsi="Apple SD Gothic Neo" w:eastAsia="Apple SD Gothic Neo"/>
+          <w:color w:val="17211D"/>
+        </w:rPr>
+        <w:t>네 조건을 모두 선택한 뒤 추천 미션과 자원 후보가 즉시 바뀌는 것을 보여준다.</w:t>
       </w:r>
     </w:p>
     <w:p>
@@ -7886,7 +8290,7 @@
           <w:rFonts w:ascii="Apple SD Gothic Neo" w:hAnsi="Apple SD Gothic Neo" w:eastAsia="Apple SD Gothic Neo"/>
           <w:color w:val="17211D"/>
         </w:rPr>
-        <w:t>자원·지도 탭에서 RAG 검색 결과, 공식 출처 링크, 지도 표시를 보여준다.</w:t>
+        <w:t>정책·문화 찾기 탭에서 RAG 검색 결과, 공식 출처 링크, 지도 표시를 보여준다.</w:t>
       </w:r>
     </w:p>
     <w:p>
@@ -7914,7 +8318,7 @@
           <w:rFonts w:ascii="Apple SD Gothic Neo" w:hAnsi="Apple SD Gothic Neo" w:eastAsia="Apple SD Gothic Neo"/>
           <w:color w:val="17211D"/>
         </w:rPr>
-        <w:t>URL 쿼리 ?operator=1 운영자 검증 탭에서 mission_id, resource_id, score, raw payload, feedback/outcome log가 내부 검증용으로만 보이는 것을 확인한다.</w:t>
+        <w:t>URL 쿼리 ?operator=1 개발자/운영자 검증 화면에서 mission_id, resource_id, score, raw payload, feedback/outcome log가 내부 검증용으로만 보이는 것을 확인한다.</w:t>
       </w:r>
     </w:p>
     <w:p>
@@ -8538,11 +8942,6 @@
       </w:pPr>
     </w:p>
     <w:p>
-      <w:r>
-        <w:br w:type="page"/>
-      </w:r>
-    </w:p>
-    <w:p>
       <w:pPr>
         <w:pStyle w:val="Heading1"/>
         <w:spacing w:before="280" w:after="120" w:line="300" w:lineRule="auto"/>
@@ -8756,6 +9155,55 @@
                 <w:color w:val="17211D"/>
                 <w:sz w:val="18"/>
               </w:rPr>
+              <w:t>uv run ruff check .</w:t>
+            </w:r>
+          </w:p>
+        </w:tc>
+        <w:tc>
+          <w:tcPr>
+            <w:tcW w:type="dxa" w:w="6860"/>
+            <w:vAlign w:val="center"/>
+          </w:tcPr>
+          <w:p>
+            <w:pPr>
+              <w:spacing w:before="0" w:after="0" w:line="276" w:lineRule="auto"/>
+              <w:jc w:val="left"/>
+            </w:pPr>
+            <w:r/>
+            <w:r>
+              <w:rPr>
+                <w:rFonts w:ascii="Apple SD Gothic Neo" w:hAnsi="Apple SD Gothic Neo" w:eastAsia="Apple SD Gothic Neo"/>
+                <w:b w:val="0"/>
+                <w:color w:val="17211D"/>
+                <w:sz w:val="18"/>
+              </w:rPr>
+              <w:t>passed</w:t>
+            </w:r>
+          </w:p>
+        </w:tc>
+      </w:tr>
+      <w:tr>
+        <w:trPr>
+          <w:cantSplit/>
+        </w:trPr>
+        <w:tc>
+          <w:tcPr>
+            <w:tcW w:type="dxa" w:w="2500"/>
+            <w:vAlign w:val="center"/>
+          </w:tcPr>
+          <w:p>
+            <w:pPr>
+              <w:spacing w:before="0" w:after="0" w:line="276" w:lineRule="auto"/>
+              <w:jc w:val="left"/>
+            </w:pPr>
+            <w:r/>
+            <w:r>
+              <w:rPr>
+                <w:rFonts w:ascii="Apple SD Gothic Neo" w:hAnsi="Apple SD Gothic Neo" w:eastAsia="Apple SD Gothic Neo"/>
+                <w:b w:val="0"/>
+                <w:color w:val="17211D"/>
+                <w:sz w:val="18"/>
+              </w:rPr>
               <w:t>make test</w:t>
             </w:r>
           </w:p>
@@ -8778,7 +9226,7 @@
                 <w:color w:val="17211D"/>
                 <w:sz w:val="18"/>
               </w:rPr>
-              <w:t>16 passed</w:t>
+              <w:t>29 passed</w:t>
             </w:r>
           </w:p>
         </w:tc>
@@ -8974,7 +9422,7 @@
                 <w:color w:val="17211D"/>
                 <w:sz w:val="18"/>
               </w:rPr>
-              <w:t>내 조건→추천 루트→지도→결과 기록 흐름, ID/score 숨김, 모바일/색상 대비 점검</w:t>
+              <w:t>desktop 1484/1152, mobile 390에서 horizontal overflow 0. 기본 URL ID/score 숨김, ?operator=1 검증 화면 확인</w:t>
             </w:r>
           </w:p>
         </w:tc>

</xml_diff>

<commit_message>
Fix desktop route layout and update docs
</commit_message>
<xml_diff>
--- a/docs/RebootRoute_Project_Report.docx
+++ b/docs/RebootRoute_Project_Report.docx
@@ -5964,7 +5964,7 @@
           <w:rFonts w:ascii="Apple SD Gothic Neo" w:hAnsi="Apple SD Gothic Neo" w:eastAsia="Apple SD Gothic Neo"/>
           <w:color w:val="17211D"/>
         </w:rPr>
-        <w:t>첫 화면은 hero, 프로젝트 설명, 공식 자료 preview, 탭, 내 루트 순서로 보이도록 재구성했습니다.</w:t>
+        <w:t>첫 화면은 hero, 프로젝트 설명, 공식 자료 carousel, 탭, 내 루트 순서로 보이도록 재구성했습니다.</w:t>
       </w:r>
     </w:p>
     <w:p>
@@ -5978,7 +5978,7 @@
           <w:rFonts w:ascii="Apple SD Gothic Neo" w:hAnsi="Apple SD Gothic Neo" w:eastAsia="Apple SD Gothic Neo"/>
           <w:color w:val="17211D"/>
         </w:rPr>
-        <w:t>네 조건 선택 전에는 추천 결과를 확정 노출하지 않고, 조건 완료 후 오늘 루트, 미션, 자원 후보, 지도 위치가 갱신됩니다.</w:t>
+        <w:t>네 조건 선택 전에는 추천 결과를 확정 노출하지 않고, 조건 완료 후 desktop에서는 네 조건 카드가 한 줄로 유지되며 오늘 미션, 공식 자원, 지도 위치가 갱신됩니다.</w:t>
       </w:r>
     </w:p>
     <w:p>
@@ -6048,7 +6048,7 @@
           <w:rFonts w:ascii="Apple SD Gothic Neo" w:hAnsi="Apple SD Gothic Neo" w:eastAsia="Apple SD Gothic Neo"/>
           <w:color w:val="17211D"/>
         </w:rPr>
-        <w:t>CSS는 base, hero, navigation, resources, route, results, footer, responsive 파일로 분리했습니다.</w:t>
+        <w:t>CSS는 base, hero, navigation, resources, route, cards, results, footer, responsive 파일로 분리했습니다.</w:t>
       </w:r>
     </w:p>
     <w:p>
@@ -6062,7 +6062,7 @@
           <w:rFonts w:ascii="Apple SD Gothic Neo" w:hAnsi="Apple SD Gothic Neo" w:eastAsia="Apple SD Gothic Neo"/>
           <w:color w:val="17211D"/>
         </w:rPr>
-        <w:t>모바일 폭에서는 hero, official resource preview, 선택 panel, 결과 카드가 한 열로 쌓이도록 반응형 CSS를 적용했습니다.</w:t>
+        <w:t>반응형 CSS는 desktop 1280px 이상에서 선택 카드 4열과 결과 영역의 미션 전체폭/공식 자료·지도 2열 구조를 유지하고, mobile에서는 한 열로 쌓이도록 적용했습니다.</w:t>
       </w:r>
     </w:p>
     <w:p>
@@ -8192,7 +8192,7 @@
           <w:rFonts w:ascii="Apple SD Gothic Neo" w:hAnsi="Apple SD Gothic Neo" w:eastAsia="Apple SD Gothic Neo"/>
           <w:color w:val="17211D"/>
         </w:rPr>
-        <w:t>Hero, 프로젝트 설명, 조건 선택 전에 볼 공식 자료 preview가 탭 위에 보이는지 확인한다.</w:t>
+        <w:t>Hero, 프로젝트 설명, 조건 선택 전에 볼 공식 자료 carousel이 탭 위에 보이는지 확인한다.</w:t>
       </w:r>
     </w:p>
     <w:p>
@@ -8206,7 +8206,7 @@
           <w:rFonts w:ascii="Apple SD Gothic Neo" w:hAnsi="Apple SD Gothic Neo" w:eastAsia="Apple SD Gothic Neo"/>
           <w:color w:val="17211D"/>
         </w:rPr>
-        <w:t>내 루트 탭에서 오늘 쓸 수 있는 시간, 사람 만나는 부담, 먼저 볼 자료, 오늘 쓸 비용을 선택한다.</w:t>
+        <w:t>내 루트 탭에서 오늘 쓸 수 있는 시간, 사람 만나는 부담, 먼저 볼 자료, 오늘 쓸 비용을 선택하고 desktop에서 네 조건 카드가 한 줄로 유지되는지 확인한다.</w:t>
       </w:r>
     </w:p>
     <w:p>

</xml_diff>

<commit_message>
Merge route resources with location context
</commit_message>
<xml_diff>
--- a/docs/RebootRoute_Project_Report.docx
+++ b/docs/RebootRoute_Project_Report.docx
@@ -519,12 +519,7 @@
         <w:spacing w:before="0" w:after="120" w:line="300" w:lineRule="auto"/>
       </w:pPr>
       <w:r>
-        <w:rPr>
-          <w:rFonts w:ascii="Apple SD Gothic Neo" w:hAnsi="Apple SD Gothic Neo" w:eastAsia="Apple SD Gothic Neo"/>
-          <w:b w:val="0"/>
-          <w:color w:val="17211D"/>
-        </w:rPr>
-        <w:t>대시보드는 사용자가 먼저 서비스 범위와 공식 자료를 확인한 뒤 조건을 고르는 구조입니다. 네 조건이 모두 선택되기 전에는 추천 결과를 확정해서 보여주지 않고, 조건이 완성되면 추천 미션, 자원 후보, 지도 위치가 즉시 갱신됩니다. 별도 업데이트 버튼이나 재추천 버튼을 누르지 않습니다.</w:t>
+        <w:t>대시보드는 사용자가 먼저 서비스 범위와 공식 자료를 확인한 뒤 조건을 고르는 구조입니다. 네 조건이 모두 선택되기 전에는 추천 결과를 확정해서 보여주지 않고, 조건이 완성되면 오늘 바로 할 행동, 추천 공식 자료 Top, 지도 위치, 추가 추천 자료가 같은 결과 영역에서 즉시 갱신됩니다. 별도 업데이트 버튼이나 재추천 버튼을 누르지 않습니다.</w:t>
       </w:r>
     </w:p>
     <w:tbl>
@@ -5974,11 +5969,7 @@
         <w:ind w:left="547" w:hanging="274"/>
       </w:pPr>
       <w:r>
-        <w:rPr>
-          <w:rFonts w:ascii="Apple SD Gothic Neo" w:hAnsi="Apple SD Gothic Neo" w:eastAsia="Apple SD Gothic Neo"/>
-          <w:color w:val="17211D"/>
-        </w:rPr>
-        <w:t>네 조건 선택 전에는 추천 결과를 확정 노출하지 않고, 조건 완료 후 desktop에서는 네 조건 카드가 한 줄로 유지되며 오늘 미션, 공식 자원, 지도 위치가 갱신됩니다.</w:t>
+        <w:t>네 조건 선택 전에는 추천 결과를 확정 노출하지 않고, 조건 완료 후 desktop에서는 네 조건 카드가 한 줄로 유지됩니다. 결과 영역은 오늘 행동을 먼저 보여준 뒤 추천 공식 자료 Top과 지도 위치를 2열로 연결하고, 아래에 추가 추천 자료를 장소 확인 블록과 함께 표시합니다.</w:t>
       </w:r>
     </w:p>
     <w:p>
@@ -6058,11 +6049,7 @@
         <w:ind w:left="547" w:hanging="274"/>
       </w:pPr>
       <w:r>
-        <w:rPr>
-          <w:rFonts w:ascii="Apple SD Gothic Neo" w:hAnsi="Apple SD Gothic Neo" w:eastAsia="Apple SD Gothic Neo"/>
-          <w:color w:val="17211D"/>
-        </w:rPr>
-        <w:t>반응형 CSS는 desktop 1280px 이상에서 선택 카드 4열과 결과 영역의 미션 전체폭/공식 자료·지도 2열 구조를 유지하고, mobile에서는 한 열로 쌓이도록 적용했습니다.</w:t>
+        <w:t>반응형 CSS는 desktop 1280px 이상에서 선택 카드 4열과 결과 영역의 미션 전체폭/추천 공식 자료 Top·지도 2열/추가 추천 자료 리스트 구조를 유지하고, mobile에서는 한 열로 쌓이도록 적용했습니다.</w:t>
       </w:r>
     </w:p>
     <w:p>
@@ -8230,11 +8217,7 @@
         <w:ind w:left="547" w:hanging="274"/>
       </w:pPr>
       <w:r>
-        <w:rPr>
-          <w:rFonts w:ascii="Apple SD Gothic Neo" w:hAnsi="Apple SD Gothic Neo" w:eastAsia="Apple SD Gothic Neo"/>
-          <w:color w:val="17211D"/>
-        </w:rPr>
-        <w:t>네 조건을 모두 선택한 뒤 추천 미션과 자원 후보가 즉시 바뀌는 것을 보여준다.</w:t>
+        <w:t>네 조건을 모두 선택한 뒤 오늘 바로 할 행동, 추천 공식 자료 Top, 지도, 추가 추천 자료가 같은 결과 영역에서 즉시 바뀌는 것을 보여준다.</w:t>
       </w:r>
     </w:p>
     <w:p>

</xml_diff>